<commit_message>
Document Android observation improvements with actual comparison
</commit_message>
<xml_diff>
--- a/docs/product/DrivingMood-Design.docx
+++ b/docs/product/DrivingMood-Design.docx
@@ -1862,7 +1862,7 @@
           <w:noProof/>
         </w:rPr>
         <w:drawing>
-          <wp:inline distT="0" distB="0" distL="0" distR="0" wp14:anchorId="51A41FAF" wp14:editId="20604E66">
+          <wp:inline distT="0" distB="0" distL="0" distR="0" wp14:anchorId="3F01187F" wp14:editId="281583E0">
             <wp:extent cx="6400800" cy="3120390"/>
             <wp:effectExtent l="0" t="0" r="0" b="0"/>
             <wp:docPr id="1" name="Picture 1"/>
@@ -3856,7 +3856,7 @@
           <w:noProof/>
         </w:rPr>
         <w:drawing>
-          <wp:inline distT="0" distB="0" distL="0" distR="0" wp14:anchorId="29AC6005" wp14:editId="54EC65CC">
+          <wp:inline distT="0" distB="0" distL="0" distR="0" wp14:anchorId="5C70E3A4" wp14:editId="71D9FE6A">
             <wp:extent cx="6400800" cy="2221454"/>
             <wp:effectExtent l="0" t="0" r="0" b="0"/>
             <wp:docPr id="2" name="Picture 2"/>
@@ -15660,7 +15660,7 @@
           <w:noProof/>
         </w:rPr>
         <w:drawing>
-          <wp:inline distT="0" distB="0" distL="0" distR="0" wp14:anchorId="0C0A35FA" wp14:editId="7EC57CC0">
+          <wp:inline distT="0" distB="0" distL="0" distR="0" wp14:anchorId="530221AB" wp14:editId="13D26C06">
             <wp:extent cx="6400800" cy="3600450"/>
             <wp:effectExtent l="0" t="0" r="0" b="0"/>
             <wp:docPr id="3" name="Picture 3"/>
@@ -16117,7 +16117,7 @@
           <w:noProof/>
         </w:rPr>
         <w:drawing>
-          <wp:inline distT="0" distB="0" distL="0" distR="0" wp14:anchorId="794FD625" wp14:editId="06D74826">
+          <wp:inline distT="0" distB="0" distL="0" distR="0" wp14:anchorId="0A86DFED" wp14:editId="73492DFC">
             <wp:extent cx="6400800" cy="6134100"/>
             <wp:effectExtent l="0" t="0" r="0" b="0"/>
             <wp:docPr id="4" name="Picture 4"/>
@@ -16214,7 +16214,7 @@
           <w:noProof/>
         </w:rPr>
         <w:drawing>
-          <wp:inline distT="0" distB="0" distL="0" distR="0" wp14:anchorId="0BF79347" wp14:editId="33D9CA7C">
+          <wp:inline distT="0" distB="0" distL="0" distR="0" wp14:anchorId="597600CD" wp14:editId="1F0993D0">
             <wp:extent cx="6400800" cy="6134100"/>
             <wp:effectExtent l="0" t="0" r="0" b="0"/>
             <wp:docPr id="5" name="Picture 5"/>
@@ -16305,7 +16305,7 @@
           <w:noProof/>
         </w:rPr>
         <w:drawing>
-          <wp:inline distT="0" distB="0" distL="0" distR="0" wp14:anchorId="4539B9A8" wp14:editId="52944E3A">
+          <wp:inline distT="0" distB="0" distL="0" distR="0" wp14:anchorId="4D785626" wp14:editId="1C8DC381">
             <wp:extent cx="6400800" cy="6134100"/>
             <wp:effectExtent l="0" t="0" r="0" b="0"/>
             <wp:docPr id="6" name="Picture 6"/>
@@ -16390,7 +16390,7 @@
           <w:noProof/>
         </w:rPr>
         <w:drawing>
-          <wp:inline distT="0" distB="0" distL="0" distR="0" wp14:anchorId="1E89EC00" wp14:editId="2C2F892D">
+          <wp:inline distT="0" distB="0" distL="0" distR="0" wp14:anchorId="0591DB39" wp14:editId="4793C564">
             <wp:extent cx="6400800" cy="3920490"/>
             <wp:effectExtent l="0" t="0" r="0" b="0"/>
             <wp:docPr id="7" name="Picture 7"/>
@@ -16701,6 +16701,342 @@
       </w:r>
     </w:p>
     <w:p>
+      <w:r>
+        <w:t>모바일</w:t>
+      </w:r>
+      <w:r>
+        <w:t xml:space="preserve"> </w:t>
+      </w:r>
+      <w:r>
+        <w:t>개발</w:t>
+      </w:r>
+      <w:r>
+        <w:t xml:space="preserve"> </w:t>
+      </w:r>
+      <w:r>
+        <w:t>후보에서도</w:t>
+      </w:r>
+      <w:r>
+        <w:t xml:space="preserve"> </w:t>
+      </w:r>
+      <w:r>
+        <w:t>같은</w:t>
+      </w:r>
+      <w:r>
+        <w:t xml:space="preserve"> </w:t>
+      </w:r>
+      <w:r>
+        <w:t>도로</w:t>
+      </w:r>
+      <w:r>
+        <w:t xml:space="preserve"> </w:t>
+      </w:r>
+      <w:r>
+        <w:t>장면을</w:t>
+      </w:r>
+      <w:r>
+        <w:t xml:space="preserve"> Android</w:t>
+      </w:r>
+      <w:r>
+        <w:t>의</w:t>
+      </w:r>
+      <w:r>
+        <w:t xml:space="preserve"> ORT·MediaPipe</w:t>
+      </w:r>
+      <w:r>
+        <w:t>에</w:t>
+      </w:r>
+      <w:r>
+        <w:t xml:space="preserve"> </w:t>
+      </w:r>
+      <w:r>
+        <w:t>직접</w:t>
+      </w:r>
+      <w:r>
+        <w:t xml:space="preserve"> </w:t>
+      </w:r>
+      <w:r>
+        <w:t>입력했다</w:t>
+      </w:r>
+      <w:r>
+        <w:t xml:space="preserve">. </w:t>
+      </w:r>
+      <w:r>
+        <w:t>기존</w:t>
+      </w:r>
+      <w:r>
+        <w:t xml:space="preserve"> </w:t>
+      </w:r>
+      <w:r>
+        <w:t>방식이</w:t>
+      </w:r>
+      <w:r>
+        <w:t xml:space="preserve"> </w:t>
+      </w:r>
+      <w:r>
+        <w:t>측정한</w:t>
+      </w:r>
+      <w:r>
+        <w:t xml:space="preserve"> 446</w:t>
+      </w:r>
+      <w:r>
+        <w:t>픽셀</w:t>
+      </w:r>
+      <w:r>
+        <w:t>·1</w:t>
+      </w:r>
+      <w:r>
+        <w:t>개</w:t>
+      </w:r>
+      <w:r>
+        <w:t xml:space="preserve"> </w:t>
+      </w:r>
+      <w:r>
+        <w:t>영역에서</w:t>
+      </w:r>
+      <w:r>
+        <w:t xml:space="preserve"> </w:t>
+      </w:r>
+      <w:r>
+        <w:t>후보는</w:t>
+      </w:r>
+      <w:r>
+        <w:t xml:space="preserve"> 2,688</w:t>
+      </w:r>
+      <w:r>
+        <w:t>픽셀</w:t>
+      </w:r>
+      <w:r>
+        <w:t>·68</w:t>
+      </w:r>
+      <w:r>
+        <w:t>개</w:t>
+      </w:r>
+      <w:r>
+        <w:t xml:space="preserve"> </w:t>
+      </w:r>
+      <w:r>
+        <w:t>영역을</w:t>
+      </w:r>
+      <w:r>
+        <w:t xml:space="preserve"> </w:t>
+      </w:r>
+      <w:r>
+        <w:t>관측했고</w:t>
+      </w:r>
+      <w:r>
+        <w:t xml:space="preserve">, </w:t>
+      </w:r>
+      <w:r>
+        <w:t>작은</w:t>
+      </w:r>
+      <w:r>
+        <w:t xml:space="preserve"> </w:t>
+      </w:r>
+      <w:r>
+        <w:t>간판과</w:t>
+      </w:r>
+      <w:r>
+        <w:t xml:space="preserve"> </w:t>
+      </w:r>
+      <w:r>
+        <w:t>넓은</w:t>
+      </w:r>
+      <w:r>
+        <w:t xml:space="preserve"> </w:t>
+      </w:r>
+      <w:r>
+        <w:t>건물</w:t>
+      </w:r>
+      <w:r>
+        <w:t xml:space="preserve"> </w:t>
+      </w:r>
+      <w:r>
+        <w:t>조명의</w:t>
+      </w:r>
+      <w:r>
+        <w:t xml:space="preserve"> </w:t>
+      </w:r>
+      <w:r>
+        <w:t>따뜻한</w:t>
+      </w:r>
+      <w:r>
+        <w:t xml:space="preserve"> </w:t>
+      </w:r>
+      <w:r>
+        <w:t>색도</w:t>
+      </w:r>
+      <w:r>
+        <w:t xml:space="preserve"> </w:t>
+      </w:r>
+      <w:r>
+        <w:t>점수에</w:t>
+      </w:r>
+      <w:r>
+        <w:t xml:space="preserve"> </w:t>
+      </w:r>
+      <w:r>
+        <w:t>남았다</w:t>
+      </w:r>
+      <w:r>
+        <w:t xml:space="preserve">. </w:t>
+      </w:r>
+      <w:r>
+        <w:t>측정</w:t>
+      </w:r>
+      <w:r>
+        <w:t xml:space="preserve"> </w:t>
+      </w:r>
+      <w:r>
+        <w:t>격자는</w:t>
+      </w:r>
+      <w:r>
+        <w:t xml:space="preserve"> 320×180</w:t>
+      </w:r>
+      <w:r>
+        <w:t>이며</w:t>
+      </w:r>
+      <w:r>
+        <w:t xml:space="preserve">, </w:t>
+      </w:r>
+      <w:r>
+        <w:t>픽셀</w:t>
+      </w:r>
+      <w:r>
+        <w:t xml:space="preserve"> </w:t>
+      </w:r>
+      <w:r>
+        <w:t>증가량은</w:t>
+      </w:r>
+      <w:r>
+        <w:t xml:space="preserve"> </w:t>
+      </w:r>
+      <w:r>
+        <w:t>관측</w:t>
+      </w:r>
+      <w:r>
+        <w:t xml:space="preserve"> </w:t>
+      </w:r>
+      <w:r>
+        <w:t>범위의</w:t>
+      </w:r>
+      <w:r>
+        <w:t xml:space="preserve"> </w:t>
+      </w:r>
+      <w:r>
+        <w:t>변화다</w:t>
+      </w:r>
+      <w:r>
+        <w:t>.</w:t>
+      </w:r>
+    </w:p>
+    <w:p>
+      <w:pPr>
+        <w:keepNext/>
+        <w:spacing w:after="40" w:line="240" w:lineRule="auto"/>
+      </w:pPr>
+      <w:r>
+        <w:rPr>
+          <w:noProof/>
+        </w:rPr>
+        <w:drawing>
+          <wp:inline distT="0" distB="0" distL="0" distR="0" wp14:anchorId="0B086333" wp14:editId="5BD25525">
+            <wp:extent cx="6400800" cy="2560320"/>
+            <wp:effectExtent l="0" t="0" r="0" b="0"/>
+            <wp:docPr id="8" name="Picture 8"/>
+            <wp:cNvGraphicFramePr>
+              <a:graphicFrameLocks xmlns:a="http://schemas.openxmlformats.org/drawingml/2006/main" noChangeAspect="1"/>
+            </wp:cNvGraphicFramePr>
+            <a:graphic xmlns:a="http://schemas.openxmlformats.org/drawingml/2006/main">
+              <a:graphicData uri="http://schemas.openxmlformats.org/drawingml/2006/picture">
+                <pic:pic xmlns:pic="http://schemas.openxmlformats.org/drawingml/2006/picture">
+                  <pic:nvPicPr>
+                    <pic:cNvPr id="0" name="mobile-observation-comparison.png"/>
+                    <pic:cNvPicPr/>
+                  </pic:nvPicPr>
+                  <pic:blipFill>
+                    <a:blip r:embed="rId21"/>
+                    <a:stretch>
+                      <a:fillRect/>
+                    </a:stretch>
+                  </pic:blipFill>
+                  <pic:spPr>
+                    <a:xfrm>
+                      <a:off x="0" y="0"/>
+                      <a:ext cx="6400800" cy="2560320"/>
+                    </a:xfrm>
+                    <a:prstGeom prst="rect">
+                      <a:avLst/>
+                    </a:prstGeom>
+                  </pic:spPr>
+                </pic:pic>
+              </a:graphicData>
+            </a:graphic>
+          </wp:inline>
+        </w:drawing>
+      </w:r>
+    </w:p>
+    <w:p>
+      <w:pPr>
+        <w:pStyle w:val="af0"/>
+        <w:spacing w:after="200"/>
+      </w:pPr>
+      <w:r>
+        <w:t>Android</w:t>
+      </w:r>
+      <w:r>
+        <w:t>의</w:t>
+      </w:r>
+      <w:r>
+        <w:t xml:space="preserve"> </w:t>
+      </w:r>
+      <w:r>
+        <w:t>동일</w:t>
+      </w:r>
+      <w:r>
+        <w:t xml:space="preserve"> </w:t>
+      </w:r>
+      <w:r>
+        <w:t>입력</w:t>
+      </w:r>
+      <w:r>
+        <w:t xml:space="preserve"> </w:t>
+      </w:r>
+      <w:r>
+        <w:t>비교</w:t>
+      </w:r>
+      <w:r>
+        <w:t xml:space="preserve">: </w:t>
+      </w:r>
+      <w:r>
+        <w:t>기존</w:t>
+      </w:r>
+      <w:r>
+        <w:t xml:space="preserve"> </w:t>
+      </w:r>
+      <w:r>
+        <w:t>관측과</w:t>
+      </w:r>
+      <w:r>
+        <w:t xml:space="preserve"> </w:t>
+      </w:r>
+      <w:r>
+        <w:t>의미분할</w:t>
+      </w:r>
+      <w:r>
+        <w:t xml:space="preserve"> </w:t>
+      </w:r>
+      <w:r>
+        <w:t>보조</w:t>
+      </w:r>
+      <w:r>
+        <w:t xml:space="preserve"> </w:t>
+      </w:r>
+      <w:r>
+        <w:t>후보</w:t>
+      </w:r>
+    </w:p>
+    <w:p>
       <w:pPr>
         <w:pStyle w:val="1"/>
         <w:pageBreakBefore/>
@@ -16732,6 +17068,268 @@
     </w:p>
     <w:p>
       <w:r>
+        <w:t>별도</w:t>
+      </w:r>
+      <w:r>
+        <w:t xml:space="preserve"> </w:t>
+      </w:r>
+      <w:r>
+        <w:t>후보</w:t>
+      </w:r>
+      <w:r>
+        <w:t xml:space="preserve"> </w:t>
+      </w:r>
+      <w:r>
+        <w:t>앱은</w:t>
+      </w:r>
+      <w:r>
+        <w:t xml:space="preserve"> </w:t>
+      </w:r>
+      <w:r>
+        <w:t>자동</w:t>
+      </w:r>
+      <w:r>
+        <w:t xml:space="preserve"> </w:t>
+      </w:r>
+      <w:r>
+        <w:t>검사</w:t>
+      </w:r>
+      <w:r>
+        <w:t xml:space="preserve"> 261</w:t>
+      </w:r>
+      <w:r>
+        <w:t>개</w:t>
+      </w:r>
+      <w:r>
+        <w:t xml:space="preserve">, </w:t>
+      </w:r>
+      <w:r>
+        <w:t>실제</w:t>
+      </w:r>
+      <w:r>
+        <w:t xml:space="preserve"> RGB </w:t>
+      </w:r>
+      <w:r>
+        <w:t>입력</w:t>
+      </w:r>
+      <w:r>
+        <w:t xml:space="preserve"> </w:t>
+      </w:r>
+      <w:r>
+        <w:t>비교</w:t>
+      </w:r>
+      <w:r>
+        <w:t>, 30</w:t>
+      </w:r>
+      <w:r>
+        <w:t>초</w:t>
+      </w:r>
+      <w:r>
+        <w:t>·60</w:t>
+      </w:r>
+      <w:r>
+        <w:t>초</w:t>
+      </w:r>
+      <w:r>
+        <w:t xml:space="preserve"> </w:t>
+      </w:r>
+      <w:r>
+        <w:t>녹화</w:t>
+      </w:r>
+      <w:r>
+        <w:t>·</w:t>
+      </w:r>
+      <w:r>
+        <w:t>분석과</w:t>
+      </w:r>
+      <w:r>
+        <w:t xml:space="preserve"> </w:t>
+      </w:r>
+      <w:r>
+        <w:t>취소</w:t>
+      </w:r>
+      <w:r>
+        <w:t xml:space="preserve"> </w:t>
+      </w:r>
+      <w:r>
+        <w:t>검사를</w:t>
+      </w:r>
+      <w:r>
+        <w:t xml:space="preserve"> </w:t>
+      </w:r>
+      <w:r>
+        <w:t>통과했다</w:t>
+      </w:r>
+      <w:r>
+        <w:t xml:space="preserve">. </w:t>
+      </w:r>
+      <w:r>
+        <w:t>의미분할</w:t>
+      </w:r>
+      <w:r>
+        <w:t xml:space="preserve"> </w:t>
+      </w:r>
+      <w:r>
+        <w:t>모델의</w:t>
+      </w:r>
+      <w:r>
+        <w:t xml:space="preserve"> </w:t>
+      </w:r>
+      <w:r>
+        <w:t>공개</w:t>
+      </w:r>
+      <w:r>
+        <w:t xml:space="preserve"> </w:t>
+      </w:r>
+      <w:r>
+        <w:t>배포</w:t>
+      </w:r>
+      <w:r>
+        <w:t xml:space="preserve"> </w:t>
+      </w:r>
+      <w:r>
+        <w:t>라이선스와</w:t>
+      </w:r>
+      <w:r>
+        <w:t xml:space="preserve"> Galaxy S25+ </w:t>
+      </w:r>
+      <w:r>
+        <w:t>성능</w:t>
+      </w:r>
+      <w:r>
+        <w:t xml:space="preserve"> </w:t>
+      </w:r>
+      <w:r>
+        <w:t>확인을</w:t>
+      </w:r>
+      <w:r>
+        <w:t xml:space="preserve"> </w:t>
+      </w:r>
+      <w:r>
+        <w:t>거쳐</w:t>
+      </w:r>
+      <w:r>
+        <w:t xml:space="preserve"> </w:t>
+      </w:r>
+      <w:r>
+        <w:t>제품에</w:t>
+      </w:r>
+      <w:r>
+        <w:t xml:space="preserve"> </w:t>
+      </w:r>
+      <w:r>
+        <w:t>통합한다</w:t>
+      </w:r>
+      <w:r>
+        <w:t xml:space="preserve">. </w:t>
+      </w:r>
+      <w:r>
+        <w:t>실제</w:t>
+      </w:r>
+      <w:r>
+        <w:t xml:space="preserve"> </w:t>
+      </w:r>
+      <w:r>
+        <w:t>주행</w:t>
+      </w:r>
+      <w:r>
+        <w:t xml:space="preserve"> 6</w:t>
+      </w:r>
+      <w:r>
+        <w:t>개의</w:t>
+      </w:r>
+      <w:r>
+        <w:t xml:space="preserve"> </w:t>
+      </w:r>
+      <w:r>
+        <w:t>후속</w:t>
+      </w:r>
+      <w:r>
+        <w:t xml:space="preserve"> </w:t>
+      </w:r>
+      <w:hyperlink r:id="rId22">
+        <w:r>
+          <w:rPr>
+            <w:color w:val="245C7A"/>
+          </w:rPr>
+          <w:t>90</w:t>
+        </w:r>
+        <w:r>
+          <w:rPr>
+            <w:color w:val="245C7A"/>
+          </w:rPr>
+          <w:t>초</w:t>
+        </w:r>
+        <w:r>
+          <w:rPr>
+            <w:color w:val="245C7A"/>
+          </w:rPr>
+          <w:t xml:space="preserve"> </w:t>
+        </w:r>
+        <w:r>
+          <w:rPr>
+            <w:color w:val="245C7A"/>
+          </w:rPr>
+          <w:t>시연</w:t>
+        </w:r>
+      </w:hyperlink>
+      <w:r>
+        <w:t>은</w:t>
+      </w:r>
+      <w:r>
+        <w:t xml:space="preserve"> 326</w:t>
+      </w:r>
+      <w:r>
+        <w:t>개</w:t>
+      </w:r>
+      <w:r>
+        <w:t xml:space="preserve"> </w:t>
+      </w:r>
+      <w:r>
+        <w:t>관측</w:t>
+      </w:r>
+      <w:r>
+        <w:t xml:space="preserve"> </w:t>
+      </w:r>
+      <w:r>
+        <w:t>프레임의</w:t>
+      </w:r>
+      <w:r>
+        <w:t xml:space="preserve"> </w:t>
+      </w:r>
+      <w:r>
+        <w:t>영역별</w:t>
+      </w:r>
+      <w:r>
+        <w:t xml:space="preserve"> </w:t>
+      </w:r>
+      <w:r>
+        <w:t>기여와</w:t>
+      </w:r>
+      <w:r>
+        <w:t xml:space="preserve"> </w:t>
+      </w:r>
+      <w:r>
+        <w:t>구간</w:t>
+      </w:r>
+      <w:r>
+        <w:t xml:space="preserve"> </w:t>
+      </w:r>
+      <w:r>
+        <w:t>결과를</w:t>
+      </w:r>
+      <w:r>
+        <w:t xml:space="preserve"> </w:t>
+      </w:r>
+      <w:r>
+        <w:t>보여준다</w:t>
+      </w:r>
+      <w:r>
+        <w:t>.</w:t>
+      </w:r>
+    </w:p>
+    <w:p>
+      <w:r>
         <w:t>0.3.0</w:t>
       </w:r>
       <w:r>
@@ -16950,7 +17548,7 @@
       <w:r>
         <w:t xml:space="preserve">. </w:t>
       </w:r>
-      <w:hyperlink r:id="rId21">
+      <w:hyperlink r:id="rId23">
         <w:r>
           <w:rPr>
             <w:color w:val="245C7A"/>
@@ -18669,7 +19267,7 @@
       <w:r>
         <w:t xml:space="preserve">1. </w:t>
       </w:r>
-      <w:hyperlink r:id="rId22">
+      <w:hyperlink r:id="rId24">
         <w:r>
           <w:rPr>
             <w:color w:val="245C7A"/>
@@ -18718,7 +19316,7 @@
       <w:r>
         <w:t xml:space="preserve">2. </w:t>
       </w:r>
-      <w:hyperlink r:id="rId23">
+      <w:hyperlink r:id="rId25">
         <w:r>
           <w:rPr>
             <w:color w:val="245C7A"/>
@@ -18779,7 +19377,7 @@
       <w:r>
         <w:t xml:space="preserve">3. </w:t>
       </w:r>
-      <w:hyperlink r:id="rId24">
+      <w:hyperlink r:id="rId26">
         <w:r>
           <w:rPr>
             <w:color w:val="245C7A"/>
@@ -18802,7 +19400,7 @@
       <w:r>
         <w:t xml:space="preserve"> </w:t>
       </w:r>
-      <w:hyperlink r:id="rId25">
+      <w:hyperlink r:id="rId27">
         <w:r>
           <w:rPr>
             <w:color w:val="245C7A"/>
@@ -18851,7 +19449,7 @@
       <w:r>
         <w:t xml:space="preserve">4. </w:t>
       </w:r>
-      <w:hyperlink r:id="rId26">
+      <w:hyperlink r:id="rId28">
         <w:r>
           <w:rPr>
             <w:color w:val="245C7A"/>
@@ -18936,7 +19534,7 @@
       <w:r>
         <w:t xml:space="preserve">5. </w:t>
       </w:r>
-      <w:hyperlink r:id="rId27">
+      <w:hyperlink r:id="rId29">
         <w:r>
           <w:rPr>
             <w:color w:val="245C7A"/>
@@ -18991,7 +19589,7 @@
       <w:r>
         <w:t xml:space="preserve">6. </w:t>
       </w:r>
-      <w:hyperlink r:id="rId28">
+      <w:hyperlink r:id="rId30">
         <w:r>
           <w:rPr>
             <w:color w:val="245C7A"/>
@@ -19052,7 +19650,7 @@
       <w:r>
         <w:t xml:space="preserve">7. </w:t>
       </w:r>
-      <w:hyperlink r:id="rId29">
+      <w:hyperlink r:id="rId31">
         <w:r>
           <w:rPr>
             <w:color w:val="245C7A"/>
@@ -19131,7 +19729,7 @@
       <w:r>
         <w:t xml:space="preserve">8. </w:t>
       </w:r>
-      <w:hyperlink r:id="rId30">
+      <w:hyperlink r:id="rId32">
         <w:r>
           <w:rPr>
             <w:color w:val="245C7A"/>
@@ -19198,7 +19796,7 @@
       <w:r>
         <w:t xml:space="preserve">9. </w:t>
       </w:r>
-      <w:hyperlink r:id="rId31">
+      <w:hyperlink r:id="rId33">
         <w:r>
           <w:rPr>
             <w:color w:val="245C7A"/>
@@ -19307,7 +19905,7 @@
       <w:r>
         <w:t xml:space="preserve">10. </w:t>
       </w:r>
-      <w:hyperlink r:id="rId32">
+      <w:hyperlink r:id="rId34">
         <w:r>
           <w:rPr>
             <w:color w:val="245C7A"/>
@@ -19386,7 +19984,7 @@
       <w:r>
         <w:t xml:space="preserve">11. </w:t>
       </w:r>
-      <w:hyperlink r:id="rId33">
+      <w:hyperlink r:id="rId35">
         <w:r>
           <w:rPr>
             <w:color w:val="245C7A"/>
@@ -19507,8 +20105,8 @@
       </w:r>
     </w:p>
     <w:sectPr>
-      <w:headerReference w:type="default" r:id="rId34"/>
-      <w:footerReference w:type="default" r:id="rId35"/>
+      <w:headerReference w:type="default" r:id="rId36"/>
+      <w:footerReference w:type="default" r:id="rId37"/>
       <w:pgSz w:w="12240" w:h="15840"/>
       <w:pgMar w:top="979" w:right="1080" w:bottom="936" w:left="1080" w:header="432" w:footer="432" w:gutter="0"/>
       <w:cols w:space="720"/>
@@ -19791,31 +20389,31 @@
       </w:rPr>
     </w:lvl>
   </w:abstractNum>
-  <w:num w:numId="1" w16cid:durableId="1141533127">
+  <w:num w:numId="1" w16cid:durableId="913704582">
     <w:abstractNumId w:val="8"/>
   </w:num>
-  <w:num w:numId="2" w16cid:durableId="327560512">
+  <w:num w:numId="2" w16cid:durableId="1922255583">
     <w:abstractNumId w:val="6"/>
   </w:num>
-  <w:num w:numId="3" w16cid:durableId="1675106807">
+  <w:num w:numId="3" w16cid:durableId="1226648755">
     <w:abstractNumId w:val="5"/>
   </w:num>
-  <w:num w:numId="4" w16cid:durableId="666786815">
+  <w:num w:numId="4" w16cid:durableId="412893434">
     <w:abstractNumId w:val="4"/>
   </w:num>
-  <w:num w:numId="5" w16cid:durableId="1826700898">
+  <w:num w:numId="5" w16cid:durableId="1594897581">
     <w:abstractNumId w:val="7"/>
   </w:num>
-  <w:num w:numId="6" w16cid:durableId="1889141733">
+  <w:num w:numId="6" w16cid:durableId="493224408">
     <w:abstractNumId w:val="3"/>
   </w:num>
-  <w:num w:numId="7" w16cid:durableId="1296521196">
+  <w:num w:numId="7" w16cid:durableId="1400715031">
     <w:abstractNumId w:val="2"/>
   </w:num>
-  <w:num w:numId="8" w16cid:durableId="628635525">
+  <w:num w:numId="8" w16cid:durableId="1439762511">
     <w:abstractNumId w:val="1"/>
   </w:num>
-  <w:num w:numId="9" w16cid:durableId="2026590606">
+  <w:num w:numId="9" w16cid:durableId="1258977063">
     <w:abstractNumId w:val="0"/>
   </w:num>
 </w:numbering>

</xml_diff>

<commit_message>
Integrate on-device semantic observation under AGPL-3.0
</commit_message>
<xml_diff>
--- a/docs/product/DrivingMood-Design.docx
+++ b/docs/product/DrivingMood-Design.docx
@@ -113,7 +113,7 @@
         <w:t>앱</w:t>
       </w:r>
       <w:r>
-        <w:t xml:space="preserve"> 0.3.0 · </w:t>
+        <w:t xml:space="preserve"> 0.3.1 · </w:t>
       </w:r>
       <w:r>
         <w:t>제품</w:t>
@@ -828,7 +828,7 @@
                 <w:color w:val="FFFFFF"/>
                 <w:sz w:val="20"/>
               </w:rPr>
-              <w:t xml:space="preserve"> 0.3.0</w:t>
+              <w:t xml:space="preserve"> 0.3.1</w:t>
             </w:r>
           </w:p>
         </w:tc>
@@ -1862,7 +1862,7 @@
           <w:noProof/>
         </w:rPr>
         <w:drawing>
-          <wp:inline distT="0" distB="0" distL="0" distR="0" wp14:anchorId="3F01187F" wp14:editId="281583E0">
+          <wp:inline distT="0" distB="0" distL="0" distR="0" wp14:anchorId="74D26E72" wp14:editId="47E40DF0">
             <wp:extent cx="6400800" cy="3120390"/>
             <wp:effectExtent l="0" t="0" r="0" b="0"/>
             <wp:docPr id="1" name="Picture 1"/>
@@ -3856,7 +3856,7 @@
           <w:noProof/>
         </w:rPr>
         <w:drawing>
-          <wp:inline distT="0" distB="0" distL="0" distR="0" wp14:anchorId="5C70E3A4" wp14:editId="71D9FE6A">
+          <wp:inline distT="0" distB="0" distL="0" distR="0" wp14:anchorId="12F79A37" wp14:editId="3FE3E448">
             <wp:extent cx="6400800" cy="2221454"/>
             <wp:effectExtent l="0" t="0" r="0" b="0"/>
             <wp:docPr id="2" name="Picture 2"/>
@@ -3939,7 +3939,7 @@
     </w:p>
     <w:p>
       <w:r>
-        <w:t>0.3.0</w:t>
+        <w:t>0.3.1</w:t>
       </w:r>
       <w:r>
         <w:t>은</w:t>
@@ -6200,7 +6200,7 @@
               <w:rPr>
                 <w:sz w:val="20"/>
               </w:rPr>
-              <w:t>0.3.0 APK</w:t>
+              <w:t>0.3.1 APK</w:t>
             </w:r>
           </w:p>
         </w:tc>
@@ -6476,31 +6476,25 @@
               <w:rPr>
                 <w:sz w:val="20"/>
               </w:rPr>
-              <w:t>데스크톱</w:t>
-            </w:r>
-            <w:r>
-              <w:rPr>
-                <w:sz w:val="20"/>
-              </w:rPr>
-              <w:t xml:space="preserve"> </w:t>
-            </w:r>
-            <w:r>
-              <w:rPr>
-                <w:sz w:val="20"/>
-              </w:rPr>
-              <w:t>예비</w:t>
-            </w:r>
-            <w:r>
-              <w:rPr>
-                <w:sz w:val="20"/>
-              </w:rPr>
-              <w:t xml:space="preserve"> </w:t>
-            </w:r>
-            <w:r>
-              <w:rPr>
-                <w:sz w:val="20"/>
-              </w:rPr>
-              <w:t>비교</w:t>
+              <w:t>320 ORT</w:t>
+            </w:r>
+            <w:r>
+              <w:rPr>
+                <w:sz w:val="20"/>
+              </w:rPr>
+              <w:t>로</w:t>
+            </w:r>
+            <w:r>
+              <w:rPr>
+                <w:sz w:val="20"/>
+              </w:rPr>
+              <w:t xml:space="preserve"> 0.3.1 APK </w:t>
+            </w:r>
+            <w:r>
+              <w:rPr>
+                <w:sz w:val="20"/>
+              </w:rPr>
+              <w:t>통합</w:t>
             </w:r>
           </w:p>
         </w:tc>
@@ -7042,19 +7036,268 @@
     </w:p>
     <w:p>
       <w:r>
-        <w:t>모바일</w:t>
-      </w:r>
-      <w:r>
-        <w:t xml:space="preserve"> </w:t>
-      </w:r>
-      <w:r>
-        <w:t>전환에서는</w:t>
-      </w:r>
-      <w:r>
-        <w:t xml:space="preserve"> </w:t>
-      </w:r>
-      <w:r>
-        <w:t>가중치</w:t>
+        <w:t xml:space="preserve">ADE20K </w:t>
+      </w:r>
+      <w:r>
+        <w:t>모델은</w:t>
+      </w:r>
+      <w:r>
+        <w:t xml:space="preserve"> </w:t>
+      </w:r>
+      <w:r>
+        <w:t>건물</w:t>
+      </w:r>
+      <w:r>
+        <w:t>·</w:t>
+      </w:r>
+      <w:r>
+        <w:t>창문</w:t>
+      </w:r>
+      <w:r>
+        <w:t>·</w:t>
+      </w:r>
+      <w:r>
+        <w:t>간판</w:t>
+      </w:r>
+      <w:r>
+        <w:t>·</w:t>
+      </w:r>
+      <w:r>
+        <w:t>사람</w:t>
+      </w:r>
+      <w:r>
+        <w:t>·</w:t>
+      </w:r>
+      <w:r>
+        <w:t>차량</w:t>
+      </w:r>
+      <w:r>
+        <w:t xml:space="preserve"> </w:t>
+      </w:r>
+      <w:r>
+        <w:t>등</w:t>
+      </w:r>
+      <w:r>
+        <w:t xml:space="preserve"> </w:t>
+      </w:r>
+      <w:r>
+        <w:t>이</w:t>
+      </w:r>
+      <w:r>
+        <w:t xml:space="preserve"> </w:t>
+      </w:r>
+      <w:r>
+        <w:t>프로젝트가</w:t>
+      </w:r>
+      <w:r>
+        <w:t xml:space="preserve"> </w:t>
+      </w:r>
+      <w:r>
+        <w:t>활용하는</w:t>
+      </w:r>
+      <w:r>
+        <w:t xml:space="preserve"> </w:t>
+      </w:r>
+      <w:r>
+        <w:t>장면</w:t>
+      </w:r>
+      <w:r>
+        <w:t xml:space="preserve"> </w:t>
+      </w:r>
+      <w:r>
+        <w:t>종류를</w:t>
+      </w:r>
+      <w:r>
+        <w:t xml:space="preserve"> </w:t>
+      </w:r>
+      <w:r>
+        <w:t>함께</w:t>
+      </w:r>
+      <w:r>
+        <w:t xml:space="preserve"> </w:t>
+      </w:r>
+      <w:r>
+        <w:t>제공한다</w:t>
+      </w:r>
+      <w:r>
+        <w:t xml:space="preserve">. </w:t>
+      </w:r>
+      <w:r>
+        <w:t>단순</w:t>
+      </w:r>
+      <w:r>
+        <w:t xml:space="preserve"> </w:t>
+      </w:r>
+      <w:r>
+        <w:t>도로</w:t>
+      </w:r>
+      <w:r>
+        <w:t xml:space="preserve"> </w:t>
+      </w:r>
+      <w:r>
+        <w:t>분할보다</w:t>
+      </w:r>
+      <w:r>
+        <w:t xml:space="preserve"> </w:t>
+      </w:r>
+      <w:r>
+        <w:t>도시</w:t>
+      </w:r>
+      <w:r>
+        <w:t xml:space="preserve"> </w:t>
+      </w:r>
+      <w:r>
+        <w:t>조명의</w:t>
+      </w:r>
+      <w:r>
+        <w:t xml:space="preserve"> </w:t>
+      </w:r>
+      <w:r>
+        <w:t>위치를</w:t>
+      </w:r>
+      <w:r>
+        <w:t xml:space="preserve"> </w:t>
+      </w:r>
+      <w:r>
+        <w:t>찾는</w:t>
+      </w:r>
+      <w:r>
+        <w:t xml:space="preserve"> </w:t>
+      </w:r>
+      <w:r>
+        <w:t>목적에</w:t>
+      </w:r>
+      <w:r>
+        <w:t xml:space="preserve"> </w:t>
+      </w:r>
+      <w:r>
+        <w:t>잘</w:t>
+      </w:r>
+      <w:r>
+        <w:t xml:space="preserve"> </w:t>
+      </w:r>
+      <w:r>
+        <w:t>맞아</w:t>
+      </w:r>
+      <w:r>
+        <w:t xml:space="preserve"> </w:t>
+      </w:r>
+      <w:r>
+        <w:t>선택했다</w:t>
+      </w:r>
+      <w:r>
+        <w:t>. 0.3.1</w:t>
+      </w:r>
+      <w:r>
+        <w:t>은</w:t>
+      </w:r>
+      <w:r>
+        <w:t xml:space="preserve"> 320 </w:t>
+      </w:r>
+      <w:r>
+        <w:t>입력과</w:t>
+      </w:r>
+      <w:r>
+        <w:t xml:space="preserve"> uint8 </w:t>
+      </w:r>
+      <w:r>
+        <w:t>클래스맵</w:t>
+      </w:r>
+      <w:r>
+        <w:t xml:space="preserve"> </w:t>
+      </w:r>
+      <w:r>
+        <w:t>출력을</w:t>
+      </w:r>
+      <w:r>
+        <w:t xml:space="preserve"> </w:t>
+      </w:r>
+      <w:r>
+        <w:t>사용하며</w:t>
+      </w:r>
+      <w:r>
+        <w:t xml:space="preserve">, </w:t>
+      </w:r>
+      <w:r>
+        <w:t>색과</w:t>
+      </w:r>
+      <w:r>
+        <w:t xml:space="preserve"> </w:t>
+      </w:r>
+      <w:r>
+        <w:t>면적은</w:t>
+      </w:r>
+      <w:r>
+        <w:t xml:space="preserve"> </w:t>
+      </w:r>
+      <w:r>
+        <w:t>동일한</w:t>
+      </w:r>
+      <w:r>
+        <w:t xml:space="preserve"> RGB</w:t>
+      </w:r>
+      <w:r>
+        <w:t>에서</w:t>
+      </w:r>
+      <w:r>
+        <w:t xml:space="preserve"> </w:t>
+      </w:r>
+      <w:r>
+        <w:t>별도</w:t>
+      </w:r>
+      <w:r>
+        <w:t xml:space="preserve"> </w:t>
+      </w:r>
+      <w:r>
+        <w:t>측정한다</w:t>
+      </w:r>
+      <w:r>
+        <w:t xml:space="preserve">. </w:t>
+      </w:r>
+      <w:r>
+        <w:t>큰</w:t>
+      </w:r>
+      <w:r>
+        <w:t xml:space="preserve"> </w:t>
+      </w:r>
+      <w:r>
+        <w:t>내부</w:t>
+      </w:r>
+      <w:r>
+        <w:t xml:space="preserve"> </w:t>
+      </w:r>
+      <w:r>
+        <w:t>텐서가</w:t>
+      </w:r>
+      <w:r>
+        <w:t xml:space="preserve"> </w:t>
+      </w:r>
+      <w:r>
+        <w:t>생길</w:t>
+      </w:r>
+      <w:r>
+        <w:t xml:space="preserve"> </w:t>
+      </w:r>
+      <w:r>
+        <w:t>수</w:t>
+      </w:r>
+      <w:r>
+        <w:t xml:space="preserve"> </w:t>
+      </w:r>
+      <w:r>
+        <w:t>있으므로</w:t>
+      </w:r>
+      <w:r>
+        <w:t xml:space="preserve"> </w:t>
+      </w:r>
+      <w:r>
+        <w:t>모델</w:t>
+      </w:r>
+      <w:r>
+        <w:t xml:space="preserve"> </w:t>
+      </w:r>
+      <w:r>
+        <w:t>파일</w:t>
       </w:r>
       <w:r>
         <w:t xml:space="preserve"> </w:t>
@@ -7066,97 +7309,25 @@
         <w:t xml:space="preserve"> </w:t>
       </w:r>
       <w:r>
+        <w:t>실제</w:t>
+      </w:r>
+      <w:r>
+        <w:t xml:space="preserve"> </w:t>
+      </w:r>
+      <w:r>
+        <w:t>메모리를</w:t>
+      </w:r>
+      <w:r>
+        <w:t xml:space="preserve"> </w:t>
+      </w:r>
+      <w:r>
         <w:t>함께</w:t>
       </w:r>
       <w:r>
         <w:t xml:space="preserve"> </w:t>
       </w:r>
       <w:r>
-        <w:t>출력</w:t>
-      </w:r>
-      <w:r>
-        <w:t xml:space="preserve"> </w:t>
-      </w:r>
-      <w:r>
-        <w:t>텐서</w:t>
-      </w:r>
-      <w:r>
-        <w:t>·</w:t>
-      </w:r>
-      <w:r>
-        <w:t>후처리</w:t>
-      </w:r>
-      <w:r>
-        <w:t xml:space="preserve"> </w:t>
-      </w:r>
-      <w:r>
-        <w:t>메모리를</w:t>
-      </w:r>
-      <w:r>
-        <w:t xml:space="preserve"> </w:t>
-      </w:r>
-      <w:r>
         <w:t>평가한다</w:t>
-      </w:r>
-      <w:r>
-        <w:t>. ADE20K</w:t>
-      </w:r>
-      <w:r>
-        <w:t>의</w:t>
-      </w:r>
-      <w:r>
-        <w:t xml:space="preserve"> 640×640×150 FP32 </w:t>
-      </w:r>
-      <w:r>
-        <w:t>출력은</w:t>
-      </w:r>
-      <w:r>
-        <w:t xml:space="preserve"> </w:t>
-      </w:r>
-      <w:r>
-        <w:t>약</w:t>
-      </w:r>
-      <w:r>
-        <w:t xml:space="preserve"> 234.4 MiB</w:t>
-      </w:r>
-      <w:r>
-        <w:t>이므로</w:t>
-      </w:r>
-      <w:r>
-        <w:t xml:space="preserve">, </w:t>
-      </w:r>
-      <w:r>
-        <w:t>후처리</w:t>
-      </w:r>
-      <w:r>
-        <w:t xml:space="preserve"> </w:t>
-      </w:r>
-      <w:r>
-        <w:t>결합</w:t>
-      </w:r>
-      <w:r>
-        <w:t>·</w:t>
-      </w:r>
-      <w:r>
-        <w:t>해상도</w:t>
-      </w:r>
-      <w:r>
-        <w:t>·</w:t>
-      </w:r>
-      <w:r>
-        <w:t>양자화를</w:t>
-      </w:r>
-      <w:r>
-        <w:t xml:space="preserve"> </w:t>
-      </w:r>
-      <w:r>
-        <w:t>함께</w:t>
-      </w:r>
-      <w:r>
-        <w:t xml:space="preserve"> </w:t>
-      </w:r>
-      <w:r>
-        <w:t>검토한다</w:t>
       </w:r>
       <w:r>
         <w:t>.</w:t>
@@ -7236,73 +7407,169 @@
         <w:t>·</w:t>
       </w:r>
       <w:r>
-        <w:t>발열</w:t>
+        <w:t>발열과</w:t>
+      </w:r>
+      <w:r>
+        <w:t xml:space="preserve"> </w:t>
+      </w:r>
+      <w:r>
+        <w:t>변환</w:t>
+      </w:r>
+      <w:r>
+        <w:t xml:space="preserve"> </w:t>
+      </w:r>
+      <w:r>
+        <w:t>가능성이다</w:t>
+      </w:r>
+      <w:r>
+        <w:t xml:space="preserve">. </w:t>
+      </w:r>
+      <w:r>
+        <w:t>앱</w:t>
+      </w:r>
+      <w:r>
+        <w:t xml:space="preserve"> </w:t>
+      </w:r>
+      <w:r>
+        <w:t>소스와</w:t>
+      </w:r>
+      <w:r>
+        <w:t xml:space="preserve"> </w:t>
+      </w:r>
+      <w:r>
+        <w:t>모델</w:t>
+      </w:r>
+      <w:r>
+        <w:t xml:space="preserve"> </w:t>
+      </w:r>
+      <w:r>
+        <w:t>고지는</w:t>
+      </w:r>
+      <w:r>
+        <w:t xml:space="preserve"> AGPL-3.0 </w:t>
+      </w:r>
+      <w:r>
+        <w:t>조건으로</w:t>
+      </w:r>
+      <w:r>
+        <w:t xml:space="preserve"> </w:t>
+      </w:r>
+      <w:r>
+        <w:t>공개하며</w:t>
       </w:r>
       <w:r>
         <w:t xml:space="preserve">, </w:t>
       </w:r>
       <w:r>
+        <w:t>원본</w:t>
+      </w:r>
+      <w:r>
+        <w:t xml:space="preserve"> </w:t>
+      </w:r>
+      <w:r>
+        <w:t>가중치와</w:t>
+      </w:r>
+      <w:r>
+        <w:t xml:space="preserve"> </w:t>
+      </w:r>
+      <w:r>
         <w:t>변환</w:t>
       </w:r>
       <w:r>
         <w:t xml:space="preserve"> </w:t>
       </w:r>
       <w:r>
-        <w:t>가능성과</w:t>
-      </w:r>
-      <w:r>
-        <w:t xml:space="preserve"> </w:t>
-      </w:r>
-      <w:r>
-        <w:t>라이선스다</w:t>
-      </w:r>
-      <w:r>
-        <w:t xml:space="preserve">. Ultralytics </w:t>
-      </w:r>
-      <w:r>
-        <w:t>후보의</w:t>
-      </w:r>
-      <w:r>
-        <w:t xml:space="preserve"> AGPL </w:t>
-      </w:r>
-      <w:r>
-        <w:t>또는</w:t>
-      </w:r>
-      <w:r>
-        <w:t xml:space="preserve"> </w:t>
-      </w:r>
-      <w:r>
-        <w:t>상용</w:t>
-      </w:r>
-      <w:r>
-        <w:t xml:space="preserve"> </w:t>
-      </w:r>
-      <w:r>
-        <w:t>조건을</w:t>
-      </w:r>
-      <w:r>
-        <w:t xml:space="preserve"> </w:t>
-      </w:r>
-      <w:r>
-        <w:t>적용</w:t>
-      </w:r>
-      <w:r>
-        <w:t xml:space="preserve"> </w:t>
-      </w:r>
-      <w:r>
-        <w:t>범위에</w:t>
-      </w:r>
-      <w:r>
-        <w:t xml:space="preserve"> </w:t>
-      </w:r>
-      <w:r>
-        <w:t>맞춰</w:t>
-      </w:r>
-      <w:r>
-        <w:t xml:space="preserve"> </w:t>
-      </w:r>
-      <w:r>
-        <w:t>확인한다</w:t>
+        <w:t>소스를</w:t>
+      </w:r>
+      <w:r>
+        <w:t xml:space="preserve"> </w:t>
+      </w:r>
+      <w:r>
+        <w:t>함께</w:t>
+      </w:r>
+      <w:r>
+        <w:t xml:space="preserve"> </w:t>
+      </w:r>
+      <w:r>
+        <w:t>제공한다</w:t>
+      </w:r>
+      <w:r>
+        <w:t xml:space="preserve">. </w:t>
+      </w:r>
+      <w:r>
+        <w:t>현재</w:t>
+      </w:r>
+      <w:r>
+        <w:t xml:space="preserve"> </w:t>
+      </w:r>
+      <w:r>
+        <w:t>가중치는</w:t>
+      </w:r>
+      <w:r>
+        <w:t xml:space="preserve"> </w:t>
+      </w:r>
+      <w:r>
+        <w:t>공식</w:t>
+      </w:r>
+      <w:r>
+        <w:t xml:space="preserve"> </w:t>
+      </w:r>
+      <w:r>
+        <w:t>사전학습</w:t>
+      </w:r>
+      <w:r>
+        <w:t xml:space="preserve"> </w:t>
+      </w:r>
+      <w:r>
+        <w:t>모델이며</w:t>
+      </w:r>
+      <w:r>
+        <w:t xml:space="preserve"> </w:t>
+      </w:r>
+      <w:r>
+        <w:t>프로젝트</w:t>
+      </w:r>
+      <w:r>
+        <w:t xml:space="preserve"> </w:t>
+      </w:r>
+      <w:r>
+        <w:t>장면의</w:t>
+      </w:r>
+      <w:r>
+        <w:t xml:space="preserve"> </w:t>
+      </w:r>
+      <w:r>
+        <w:t>파인튜닝은</w:t>
+      </w:r>
+      <w:r>
+        <w:t xml:space="preserve"> </w:t>
+      </w:r>
+      <w:r>
+        <w:t>별도</w:t>
+      </w:r>
+      <w:r>
+        <w:t xml:space="preserve"> </w:t>
+      </w:r>
+      <w:r>
+        <w:t>학습</w:t>
+      </w:r>
+      <w:r>
+        <w:t>·</w:t>
+      </w:r>
+      <w:r>
+        <w:t>평가</w:t>
+      </w:r>
+      <w:r>
+        <w:t xml:space="preserve"> </w:t>
+      </w:r>
+      <w:r>
+        <w:t>단계로</w:t>
+      </w:r>
+      <w:r>
+        <w:t xml:space="preserve"> </w:t>
+      </w:r>
+      <w:r>
+        <w:t>진행한다</w:t>
       </w:r>
       <w:r>
         <w:t>.</w:t>
@@ -11372,7 +11639,7 @@
     </w:p>
     <w:p>
       <w:r>
-        <w:t>0.3.0</w:t>
+        <w:t>0.3.1</w:t>
       </w:r>
       <w:r>
         <w:t>은</w:t>
@@ -11405,31 +11672,25 @@
         <w:t xml:space="preserve"> </w:t>
       </w:r>
       <w:r>
-        <w:t>실제</w:t>
-      </w:r>
-      <w:r>
-        <w:t xml:space="preserve"> </w:t>
-      </w:r>
-      <w:r>
-        <w:t>픽셀</w:t>
-      </w:r>
-      <w:r>
-        <w:t xml:space="preserve"> </w:t>
-      </w:r>
-      <w:r>
-        <w:t>분포</w:t>
-      </w:r>
-      <w:r>
-        <w:t xml:space="preserve">, </w:t>
-      </w:r>
-      <w:r>
-        <w:t>요소별</w:t>
-      </w:r>
-      <w:r>
-        <w:t xml:space="preserve"> </w:t>
-      </w:r>
-      <w:r>
-        <w:t>기여를</w:t>
+        <w:t>의미분할</w:t>
+      </w:r>
+      <w:r>
+        <w:t xml:space="preserve"> </w:t>
+      </w:r>
+      <w:r>
+        <w:t>보조</w:t>
+      </w:r>
+      <w:r>
+        <w:t xml:space="preserve"> </w:t>
+      </w:r>
+      <w:r>
+        <w:t>관측을</w:t>
+      </w:r>
+      <w:r>
+        <w:t xml:space="preserve"> </w:t>
+      </w:r>
+      <w:r>
+        <w:t>모바일에</w:t>
       </w:r>
       <w:r>
         <w:t xml:space="preserve"> </w:t>
@@ -11453,43 +11714,19 @@
         <w:t xml:space="preserve"> </w:t>
       </w:r>
       <w:r>
-        <w:t>작은</w:t>
-      </w:r>
-      <w:r>
-        <w:t xml:space="preserve"> </w:t>
-      </w:r>
-      <w:r>
-        <w:t>간판</w:t>
-      </w:r>
-      <w:r>
-        <w:t>·</w:t>
-      </w:r>
-      <w:r>
-        <w:t>넓은</w:t>
-      </w:r>
-      <w:r>
-        <w:t xml:space="preserve"> </w:t>
-      </w:r>
-      <w:r>
-        <w:t>조명</w:t>
-      </w:r>
-      <w:r>
-        <w:t xml:space="preserve"> </w:t>
-      </w:r>
-      <w:r>
-        <w:t>관측의</w:t>
-      </w:r>
-      <w:r>
-        <w:t xml:space="preserve"> </w:t>
-      </w:r>
-      <w:r>
-        <w:t>모바일</w:t>
-      </w:r>
-      <w:r>
-        <w:t xml:space="preserve"> </w:t>
-      </w:r>
-      <w:r>
-        <w:t>적용과</w:t>
+        <w:t>프로젝트</w:t>
+      </w:r>
+      <w:r>
+        <w:t xml:space="preserve"> </w:t>
+      </w:r>
+      <w:r>
+        <w:t>장면의</w:t>
+      </w:r>
+      <w:r>
+        <w:t xml:space="preserve"> </w:t>
+      </w:r>
+      <w:r>
+        <w:t>파인튜닝과</w:t>
       </w:r>
       <w:r>
         <w:t xml:space="preserve"> </w:t>
@@ -15660,7 +15897,7 @@
           <w:noProof/>
         </w:rPr>
         <w:drawing>
-          <wp:inline distT="0" distB="0" distL="0" distR="0" wp14:anchorId="530221AB" wp14:editId="13D26C06">
+          <wp:inline distT="0" distB="0" distL="0" distR="0" wp14:anchorId="24B96FC1" wp14:editId="79011188">
             <wp:extent cx="6400800" cy="3600450"/>
             <wp:effectExtent l="0" t="0" r="0" b="0"/>
             <wp:docPr id="3" name="Picture 3"/>
@@ -16117,7 +16354,7 @@
           <w:noProof/>
         </w:rPr>
         <w:drawing>
-          <wp:inline distT="0" distB="0" distL="0" distR="0" wp14:anchorId="0A86DFED" wp14:editId="73492DFC">
+          <wp:inline distT="0" distB="0" distL="0" distR="0" wp14:anchorId="390A871E" wp14:editId="63EE5559">
             <wp:extent cx="6400800" cy="6134100"/>
             <wp:effectExtent l="0" t="0" r="0" b="0"/>
             <wp:docPr id="4" name="Picture 4"/>
@@ -16214,7 +16451,7 @@
           <w:noProof/>
         </w:rPr>
         <w:drawing>
-          <wp:inline distT="0" distB="0" distL="0" distR="0" wp14:anchorId="597600CD" wp14:editId="1F0993D0">
+          <wp:inline distT="0" distB="0" distL="0" distR="0" wp14:anchorId="494D342A" wp14:editId="31D6FA43">
             <wp:extent cx="6400800" cy="6134100"/>
             <wp:effectExtent l="0" t="0" r="0" b="0"/>
             <wp:docPr id="5" name="Picture 5"/>
@@ -16305,7 +16542,7 @@
           <w:noProof/>
         </w:rPr>
         <w:drawing>
-          <wp:inline distT="0" distB="0" distL="0" distR="0" wp14:anchorId="4D785626" wp14:editId="1C8DC381">
+          <wp:inline distT="0" distB="0" distL="0" distR="0" wp14:anchorId="1F4BAF5D" wp14:editId="35934027">
             <wp:extent cx="6400800" cy="6134100"/>
             <wp:effectExtent l="0" t="0" r="0" b="0"/>
             <wp:docPr id="6" name="Picture 6"/>
@@ -16390,7 +16627,7 @@
           <w:noProof/>
         </w:rPr>
         <w:drawing>
-          <wp:inline distT="0" distB="0" distL="0" distR="0" wp14:anchorId="0591DB39" wp14:editId="4793C564">
+          <wp:inline distT="0" distB="0" distL="0" distR="0" wp14:anchorId="6D10E8F0" wp14:editId="3CC5380C">
             <wp:extent cx="6400800" cy="3920490"/>
             <wp:effectExtent l="0" t="0" r="0" b="0"/>
             <wp:docPr id="7" name="Picture 7"/>
@@ -16940,7 +17177,7 @@
           <w:noProof/>
         </w:rPr>
         <w:drawing>
-          <wp:inline distT="0" distB="0" distL="0" distR="0" wp14:anchorId="0B086333" wp14:editId="5BD25525">
+          <wp:inline distT="0" distB="0" distL="0" distR="0" wp14:anchorId="7503FDBF" wp14:editId="352A7CFA">
             <wp:extent cx="6400800" cy="2560320"/>
             <wp:effectExtent l="0" t="0" r="0" b="0"/>
             <wp:docPr id="8" name="Picture 8"/>
@@ -17068,22 +17305,40 @@
     </w:p>
     <w:p>
       <w:r>
-        <w:t>별도</w:t>
-      </w:r>
-      <w:r>
-        <w:t xml:space="preserve"> </w:t>
-      </w:r>
-      <w:r>
-        <w:t>후보</w:t>
-      </w:r>
-      <w:r>
-        <w:t xml:space="preserve"> </w:t>
-      </w:r>
-      <w:r>
-        <w:t>앱은</w:t>
-      </w:r>
-      <w:r>
-        <w:t xml:space="preserve"> </w:t>
+        <w:t>의미분할</w:t>
+      </w:r>
+      <w:r>
+        <w:t xml:space="preserve"> </w:t>
+      </w:r>
+      <w:r>
+        <w:t>관측은</w:t>
+      </w:r>
+      <w:r>
+        <w:t xml:space="preserve"> 0.3.1</w:t>
+      </w:r>
+      <w:r>
+        <w:t>의</w:t>
+      </w:r>
+      <w:r>
+        <w:t xml:space="preserve"> </w:t>
+      </w:r>
+      <w:r>
+        <w:t>기본</w:t>
+      </w:r>
+      <w:r>
+        <w:t xml:space="preserve"> </w:t>
+      </w:r>
+      <w:r>
+        <w:t>분석기로</w:t>
+      </w:r>
+      <w:r>
+        <w:t xml:space="preserve"> </w:t>
+      </w:r>
+      <w:r>
+        <w:t>통합했다</w:t>
+      </w:r>
+      <w:r>
+        <w:t xml:space="preserve">. </w:t>
       </w:r>
       <w:r>
         <w:t>자동</w:t>
@@ -17159,66 +17414,6 @@
       </w:r>
       <w:r>
         <w:t>통과했다</w:t>
-      </w:r>
-      <w:r>
-        <w:t xml:space="preserve">. </w:t>
-      </w:r>
-      <w:r>
-        <w:t>의미분할</w:t>
-      </w:r>
-      <w:r>
-        <w:t xml:space="preserve"> </w:t>
-      </w:r>
-      <w:r>
-        <w:t>모델의</w:t>
-      </w:r>
-      <w:r>
-        <w:t xml:space="preserve"> </w:t>
-      </w:r>
-      <w:r>
-        <w:t>공개</w:t>
-      </w:r>
-      <w:r>
-        <w:t xml:space="preserve"> </w:t>
-      </w:r>
-      <w:r>
-        <w:t>배포</w:t>
-      </w:r>
-      <w:r>
-        <w:t xml:space="preserve"> </w:t>
-      </w:r>
-      <w:r>
-        <w:t>라이선스와</w:t>
-      </w:r>
-      <w:r>
-        <w:t xml:space="preserve"> Galaxy S25+ </w:t>
-      </w:r>
-      <w:r>
-        <w:t>성능</w:t>
-      </w:r>
-      <w:r>
-        <w:t xml:space="preserve"> </w:t>
-      </w:r>
-      <w:r>
-        <w:t>확인을</w:t>
-      </w:r>
-      <w:r>
-        <w:t xml:space="preserve"> </w:t>
-      </w:r>
-      <w:r>
-        <w:t>거쳐</w:t>
-      </w:r>
-      <w:r>
-        <w:t xml:space="preserve"> </w:t>
-      </w:r>
-      <w:r>
-        <w:t>제품에</w:t>
-      </w:r>
-      <w:r>
-        <w:t xml:space="preserve"> </w:t>
-      </w:r>
-      <w:r>
-        <w:t>통합한다</w:t>
       </w:r>
       <w:r>
         <w:t xml:space="preserve">. </w:t>
@@ -17330,16 +17525,22 @@
     </w:p>
     <w:p>
       <w:r>
-        <w:t>0.3.0</w:t>
+        <w:t>0.3.1</w:t>
       </w:r>
       <w:r>
         <w:t>은</w:t>
       </w:r>
       <w:r>
-        <w:t xml:space="preserve"> </w:t>
-      </w:r>
-      <w:r>
-        <w:t>자동</w:t>
+        <w:t xml:space="preserve"> Android </w:t>
+      </w:r>
+      <w:r>
+        <w:t>에뮬레이터</w:t>
+      </w:r>
+      <w:r>
+        <w:t xml:space="preserve"> </w:t>
+      </w:r>
+      <w:r>
+        <w:t>녹화</w:t>
       </w:r>
       <w:r>
         <w:t xml:space="preserve"> </w:t>
@@ -17348,31 +17549,43 @@
         <w:t>검사</w:t>
       </w:r>
       <w:r>
-        <w:t xml:space="preserve"> 250</w:t>
+        <w:t xml:space="preserve"> 5</w:t>
       </w:r>
       <w:r>
         <w:t>개와</w:t>
       </w:r>
       <w:r>
-        <w:t xml:space="preserve"> Android </w:t>
-      </w:r>
-      <w:r>
-        <w:t>에뮬레이터</w:t>
-      </w:r>
-      <w:r>
-        <w:t xml:space="preserve"> </w:t>
-      </w:r>
-      <w:r>
-        <w:t>기능</w:t>
-      </w:r>
-      <w:r>
-        <w:t xml:space="preserve"> </w:t>
+        <w:t xml:space="preserve"> </w:t>
+      </w:r>
+      <w:r>
+        <w:t>최종</w:t>
+      </w:r>
+      <w:r>
+        <w:t xml:space="preserve"> </w:t>
+      </w:r>
+      <w:r>
+        <w:t>서명</w:t>
+      </w:r>
+      <w:r>
+        <w:t xml:space="preserve"> APK</w:t>
+      </w:r>
+      <w:r>
+        <w:t>의</w:t>
+      </w:r>
+      <w:r>
+        <w:t xml:space="preserve"> </w:t>
+      </w:r>
+      <w:r>
+        <w:t>구성</w:t>
+      </w:r>
+      <w:r>
+        <w:t xml:space="preserve">·RGB </w:t>
       </w:r>
       <w:r>
         <w:t>검사</w:t>
       </w:r>
       <w:r>
-        <w:t xml:space="preserve"> 5</w:t>
+        <w:t xml:space="preserve"> 2</w:t>
       </w:r>
       <w:r>
         <w:t>개</w:t>
@@ -20389,31 +20602,31 @@
       </w:rPr>
     </w:lvl>
   </w:abstractNum>
-  <w:num w:numId="1" w16cid:durableId="913704582">
+  <w:num w:numId="1" w16cid:durableId="1075786373">
     <w:abstractNumId w:val="8"/>
   </w:num>
-  <w:num w:numId="2" w16cid:durableId="1922255583">
+  <w:num w:numId="2" w16cid:durableId="1446000345">
     <w:abstractNumId w:val="6"/>
   </w:num>
-  <w:num w:numId="3" w16cid:durableId="1226648755">
+  <w:num w:numId="3" w16cid:durableId="37439330">
     <w:abstractNumId w:val="5"/>
   </w:num>
-  <w:num w:numId="4" w16cid:durableId="412893434">
+  <w:num w:numId="4" w16cid:durableId="1026097174">
     <w:abstractNumId w:val="4"/>
   </w:num>
-  <w:num w:numId="5" w16cid:durableId="1594897581">
+  <w:num w:numId="5" w16cid:durableId="1944923819">
     <w:abstractNumId w:val="7"/>
   </w:num>
-  <w:num w:numId="6" w16cid:durableId="493224408">
+  <w:num w:numId="6" w16cid:durableId="7829192">
     <w:abstractNumId w:val="3"/>
   </w:num>
-  <w:num w:numId="7" w16cid:durableId="1400715031">
+  <w:num w:numId="7" w16cid:durableId="1827933836">
     <w:abstractNumId w:val="2"/>
   </w:num>
-  <w:num w:numId="8" w16cid:durableId="1439762511">
+  <w:num w:numId="8" w16cid:durableId="1429235035">
     <w:abstractNumId w:val="1"/>
   </w:num>
-  <w:num w:numId="9" w16cid:durableId="1258977063">
+  <w:num w:numId="9" w16cid:durableId="1155606367">
     <w:abstractNumId w:val="0"/>
   </w:num>
 </w:numbering>

</xml_diff>

<commit_message>
Document fine-tuning pilot evidence and vehicle integration plan
</commit_message>
<xml_diff>
--- a/docs/product/DrivingMood-Design.docx
+++ b/docs/product/DrivingMood-Design.docx
@@ -1862,7 +1862,7 @@
           <w:noProof/>
         </w:rPr>
         <w:drawing>
-          <wp:inline distT="0" distB="0" distL="0" distR="0" wp14:anchorId="74D26E72" wp14:editId="47E40DF0">
+          <wp:inline distT="0" distB="0" distL="0" distR="0" wp14:anchorId="3BCCFECA" wp14:editId="42575C4E">
             <wp:extent cx="6400800" cy="3120390"/>
             <wp:effectExtent l="0" t="0" r="0" b="0"/>
             <wp:docPr id="1" name="Picture 1"/>
@@ -3856,7 +3856,7 @@
           <w:noProof/>
         </w:rPr>
         <w:drawing>
-          <wp:inline distT="0" distB="0" distL="0" distR="0" wp14:anchorId="12F79A37" wp14:editId="3FE3E448">
+          <wp:inline distT="0" distB="0" distL="0" distR="0" wp14:anchorId="2C7CFCC5" wp14:editId="51F9E2A3">
             <wp:extent cx="6400800" cy="2221454"/>
             <wp:effectExtent l="0" t="0" r="0" b="0"/>
             <wp:docPr id="2" name="Picture 2"/>
@@ -7069,31 +7069,223 @@
         <w:t>·</w:t>
       </w:r>
       <w:r>
+        <w:t>차량을</w:t>
+      </w:r>
+      <w:r>
+        <w:t xml:space="preserve"> </w:t>
+      </w:r>
+      <w:r>
+        <w:t>함께</w:t>
+      </w:r>
+      <w:r>
+        <w:t xml:space="preserve"> </w:t>
+      </w:r>
+      <w:r>
+        <w:t>제공한다</w:t>
+      </w:r>
+      <w:r>
+        <w:t xml:space="preserve">. </w:t>
+      </w:r>
+      <w:r>
+        <w:t>창문과</w:t>
+      </w:r>
+      <w:r>
+        <w:t xml:space="preserve"> </w:t>
+      </w:r>
+      <w:r>
+        <w:t>상점</w:t>
+      </w:r>
+      <w:r>
+        <w:t xml:space="preserve"> </w:t>
+      </w:r>
+      <w:r>
+        <w:t>간판의</w:t>
+      </w:r>
+      <w:r>
+        <w:t xml:space="preserve"> </w:t>
+      </w:r>
+      <w:r>
+        <w:t>별도</w:t>
+      </w:r>
+      <w:r>
+        <w:t xml:space="preserve"> </w:t>
+      </w:r>
+      <w:r>
+        <w:t>클래스가</w:t>
+      </w:r>
+      <w:r>
+        <w:t xml:space="preserve"> </w:t>
+      </w:r>
+      <w:r>
+        <w:t>없는</w:t>
+      </w:r>
+      <w:r>
+        <w:t xml:space="preserve"> Cityscapes</w:t>
+      </w:r>
+      <w:r>
+        <w:t>보다</w:t>
+      </w:r>
+      <w:r>
+        <w:t xml:space="preserve"> </w:t>
+      </w:r>
+      <w:r>
+        <w:t>도시</w:t>
+      </w:r>
+      <w:r>
+        <w:t xml:space="preserve"> </w:t>
+      </w:r>
+      <w:r>
+        <w:t>조명의</w:t>
+      </w:r>
+      <w:r>
+        <w:t xml:space="preserve"> </w:t>
+      </w:r>
+      <w:r>
+        <w:t>위치를</w:t>
+      </w:r>
+      <w:r>
+        <w:t xml:space="preserve"> </w:t>
+      </w:r>
+      <w:r>
+        <w:t>찾는</w:t>
+      </w:r>
+      <w:r>
+        <w:t xml:space="preserve"> </w:t>
+      </w:r>
+      <w:r>
+        <w:t>목적에</w:t>
+      </w:r>
+      <w:r>
+        <w:t xml:space="preserve"> </w:t>
+      </w:r>
+      <w:r>
+        <w:t>맞아</w:t>
+      </w:r>
+      <w:r>
+        <w:t xml:space="preserve"> </w:t>
+      </w:r>
+      <w:r>
+        <w:t>선택했다</w:t>
+      </w:r>
+      <w:r>
+        <w:t xml:space="preserve">. nano </w:t>
+      </w:r>
+      <w:r>
+        <w:t>크기는</w:t>
+      </w:r>
+      <w:r>
+        <w:t xml:space="preserve"> </w:t>
+      </w:r>
+      <w:r>
+        <w:t>기존</w:t>
+      </w:r>
+      <w:r>
+        <w:t xml:space="preserve"> </w:t>
+      </w:r>
+      <w:r>
+        <w:t>장면</w:t>
+      </w:r>
+      <w:r>
+        <w:t xml:space="preserve"> </w:t>
+      </w:r>
+      <w:r>
+        <w:t>비교와</w:t>
+      </w:r>
+      <w:r>
+        <w:t xml:space="preserve"> </w:t>
+      </w:r>
+      <w:r>
+        <w:t>모바일</w:t>
+      </w:r>
+      <w:r>
+        <w:t xml:space="preserve"> </w:t>
+      </w:r>
+      <w:r>
+        <w:t>변환</w:t>
+      </w:r>
+      <w:r>
+        <w:t xml:space="preserve"> </w:t>
+      </w:r>
+      <w:r>
+        <w:t>경로를</w:t>
+      </w:r>
+      <w:r>
+        <w:t xml:space="preserve"> </w:t>
+      </w:r>
+      <w:r>
+        <w:t>기준으로</w:t>
+      </w:r>
+      <w:r>
+        <w:t xml:space="preserve"> </w:t>
+      </w:r>
+      <w:r>
+        <w:t>채택했다</w:t>
+      </w:r>
+      <w:r>
+        <w:t xml:space="preserve">. </w:t>
+      </w:r>
+      <w:r>
+        <w:t>큰</w:t>
+      </w:r>
+      <w:r>
+        <w:t xml:space="preserve"> </w:t>
+      </w:r>
+      <w:r>
+        <w:t>모델에서도</w:t>
+      </w:r>
+      <w:r>
+        <w:t xml:space="preserve"> </w:t>
+      </w:r>
+      <w:r>
+        <w:t>반사</w:t>
+      </w:r>
+      <w:r>
+        <w:t>·</w:t>
+      </w:r>
+      <w:r>
         <w:t>차량</w:t>
       </w:r>
       <w:r>
         <w:t xml:space="preserve"> </w:t>
       </w:r>
       <w:r>
-        <w:t>등</w:t>
-      </w:r>
-      <w:r>
-        <w:t xml:space="preserve"> </w:t>
-      </w:r>
-      <w:r>
-        <w:t>이</w:t>
-      </w:r>
-      <w:r>
-        <w:t xml:space="preserve"> </w:t>
-      </w:r>
-      <w:r>
-        <w:t>프로젝트가</w:t>
-      </w:r>
-      <w:r>
-        <w:t xml:space="preserve"> </w:t>
-      </w:r>
-      <w:r>
-        <w:t>활용하는</w:t>
+        <w:t>내부</w:t>
+      </w:r>
+      <w:r>
+        <w:t xml:space="preserve"> </w:t>
+      </w:r>
+      <w:r>
+        <w:t>등의</w:t>
+      </w:r>
+      <w:r>
+        <w:t xml:space="preserve"> </w:t>
+      </w:r>
+      <w:r>
+        <w:t>오류가</w:t>
+      </w:r>
+      <w:r>
+        <w:t xml:space="preserve"> </w:t>
+      </w:r>
+      <w:r>
+        <w:t>남아</w:t>
+      </w:r>
+      <w:r>
+        <w:t xml:space="preserve">, </w:t>
+      </w:r>
+      <w:r>
+        <w:t>같은</w:t>
+      </w:r>
+      <w:r>
+        <w:t xml:space="preserve"> </w:t>
+      </w:r>
+      <w:r>
+        <w:t>구조의</w:t>
+      </w:r>
+      <w:r>
+        <w:t xml:space="preserve"> </w:t>
+      </w:r>
+      <w:r>
+        <w:t>주행</w:t>
       </w:r>
       <w:r>
         <w:t xml:space="preserve"> </w:t>
@@ -7105,229 +7297,25 @@
         <w:t xml:space="preserve"> </w:t>
       </w:r>
       <w:r>
-        <w:t>종류를</w:t>
-      </w:r>
-      <w:r>
-        <w:t xml:space="preserve"> </w:t>
-      </w:r>
-      <w:r>
-        <w:t>함께</w:t>
-      </w:r>
-      <w:r>
-        <w:t xml:space="preserve"> </w:t>
-      </w:r>
-      <w:r>
-        <w:t>제공한다</w:t>
-      </w:r>
-      <w:r>
-        <w:t xml:space="preserve">. </w:t>
-      </w:r>
-      <w:r>
-        <w:t>단순</w:t>
-      </w:r>
-      <w:r>
-        <w:t xml:space="preserve"> </w:t>
-      </w:r>
-      <w:r>
-        <w:t>도로</w:t>
-      </w:r>
-      <w:r>
-        <w:t xml:space="preserve"> </w:t>
-      </w:r>
-      <w:r>
-        <w:t>분할보다</w:t>
-      </w:r>
-      <w:r>
-        <w:t xml:space="preserve"> </w:t>
-      </w:r>
-      <w:r>
-        <w:t>도시</w:t>
-      </w:r>
-      <w:r>
-        <w:t xml:space="preserve"> </w:t>
-      </w:r>
-      <w:r>
-        <w:t>조명의</w:t>
-      </w:r>
-      <w:r>
-        <w:t xml:space="preserve"> </w:t>
-      </w:r>
-      <w:r>
-        <w:t>위치를</w:t>
-      </w:r>
-      <w:r>
-        <w:t xml:space="preserve"> </w:t>
-      </w:r>
-      <w:r>
-        <w:t>찾는</w:t>
-      </w:r>
-      <w:r>
-        <w:t xml:space="preserve"> </w:t>
-      </w:r>
-      <w:r>
-        <w:t>목적에</w:t>
-      </w:r>
-      <w:r>
-        <w:t xml:space="preserve"> </w:t>
-      </w:r>
-      <w:r>
-        <w:t>잘</w:t>
-      </w:r>
-      <w:r>
-        <w:t xml:space="preserve"> </w:t>
-      </w:r>
-      <w:r>
-        <w:t>맞아</w:t>
-      </w:r>
-      <w:r>
-        <w:t xml:space="preserve"> </w:t>
-      </w:r>
-      <w:r>
-        <w:t>선택했다</w:t>
-      </w:r>
-      <w:r>
-        <w:t>. 0.3.1</w:t>
-      </w:r>
-      <w:r>
-        <w:t>은</w:t>
-      </w:r>
-      <w:r>
-        <w:t xml:space="preserve"> 320 </w:t>
-      </w:r>
-      <w:r>
-        <w:t>입력과</w:t>
-      </w:r>
-      <w:r>
-        <w:t xml:space="preserve"> uint8 </w:t>
-      </w:r>
-      <w:r>
-        <w:t>클래스맵</w:t>
-      </w:r>
-      <w:r>
-        <w:t xml:space="preserve"> </w:t>
-      </w:r>
-      <w:r>
-        <w:t>출력을</w:t>
-      </w:r>
-      <w:r>
-        <w:t xml:space="preserve"> </w:t>
-      </w:r>
-      <w:r>
-        <w:t>사용하며</w:t>
-      </w:r>
-      <w:r>
-        <w:t xml:space="preserve">, </w:t>
-      </w:r>
-      <w:r>
-        <w:t>색과</w:t>
-      </w:r>
-      <w:r>
-        <w:t xml:space="preserve"> </w:t>
-      </w:r>
-      <w:r>
-        <w:t>면적은</w:t>
-      </w:r>
-      <w:r>
-        <w:t xml:space="preserve"> </w:t>
-      </w:r>
-      <w:r>
-        <w:t>동일한</w:t>
-      </w:r>
-      <w:r>
-        <w:t xml:space="preserve"> RGB</w:t>
-      </w:r>
-      <w:r>
-        <w:t>에서</w:t>
-      </w:r>
-      <w:r>
-        <w:t xml:space="preserve"> </w:t>
-      </w:r>
-      <w:r>
-        <w:t>별도</w:t>
-      </w:r>
-      <w:r>
-        <w:t xml:space="preserve"> </w:t>
-      </w:r>
-      <w:r>
-        <w:t>측정한다</w:t>
-      </w:r>
-      <w:r>
-        <w:t xml:space="preserve">. </w:t>
-      </w:r>
-      <w:r>
-        <w:t>큰</w:t>
-      </w:r>
-      <w:r>
-        <w:t xml:space="preserve"> </w:t>
-      </w:r>
-      <w:r>
-        <w:t>내부</w:t>
-      </w:r>
-      <w:r>
-        <w:t xml:space="preserve"> </w:t>
-      </w:r>
-      <w:r>
-        <w:t>텐서가</w:t>
-      </w:r>
-      <w:r>
-        <w:t xml:space="preserve"> </w:t>
-      </w:r>
-      <w:r>
-        <w:t>생길</w:t>
-      </w:r>
-      <w:r>
-        <w:t xml:space="preserve"> </w:t>
-      </w:r>
-      <w:r>
-        <w:t>수</w:t>
-      </w:r>
-      <w:r>
-        <w:t xml:space="preserve"> </w:t>
-      </w:r>
-      <w:r>
-        <w:t>있으므로</w:t>
-      </w:r>
-      <w:r>
-        <w:t xml:space="preserve"> </w:t>
-      </w:r>
-      <w:r>
-        <w:t>모델</w:t>
-      </w:r>
-      <w:r>
-        <w:t xml:space="preserve"> </w:t>
-      </w:r>
-      <w:r>
-        <w:t>파일</w:t>
-      </w:r>
-      <w:r>
-        <w:t xml:space="preserve"> </w:t>
-      </w:r>
-      <w:r>
-        <w:t>크기와</w:t>
-      </w:r>
-      <w:r>
-        <w:t xml:space="preserve"> </w:t>
-      </w:r>
-      <w:r>
-        <w:t>실제</w:t>
-      </w:r>
-      <w:r>
-        <w:t xml:space="preserve"> </w:t>
-      </w:r>
-      <w:r>
-        <w:t>메모리를</w:t>
-      </w:r>
-      <w:r>
-        <w:t xml:space="preserve"> </w:t>
-      </w:r>
-      <w:r>
-        <w:t>함께</w:t>
-      </w:r>
-      <w:r>
-        <w:t xml:space="preserve"> </w:t>
-      </w:r>
-      <w:r>
-        <w:t>평가한다</w:t>
+        <w:t>추가</w:t>
+      </w:r>
+      <w:r>
+        <w:t xml:space="preserve"> </w:t>
+      </w:r>
+      <w:r>
+        <w:t>학습을</w:t>
+      </w:r>
+      <w:r>
+        <w:t xml:space="preserve"> </w:t>
+      </w:r>
+      <w:r>
+        <w:t>먼저</w:t>
+      </w:r>
+      <w:r>
+        <w:t xml:space="preserve"> </w:t>
+      </w:r>
+      <w:r>
+        <w:t>검증했다</w:t>
       </w:r>
       <w:r>
         <w:t>.</w:t>
@@ -7335,6 +7323,75 @@
     </w:p>
     <w:p>
       <w:r>
+        <w:t>0.3.1</w:t>
+      </w:r>
+      <w:r>
+        <w:t>은</w:t>
+      </w:r>
+      <w:r>
+        <w:t xml:space="preserve"> 320 </w:t>
+      </w:r>
+      <w:r>
+        <w:t>입력과</w:t>
+      </w:r>
+      <w:r>
+        <w:t xml:space="preserve"> 150</w:t>
+      </w:r>
+      <w:r>
+        <w:t>종</w:t>
+      </w:r>
+      <w:r>
+        <w:t xml:space="preserve"> uint8 </w:t>
+      </w:r>
+      <w:r>
+        <w:t>클래스맵</w:t>
+      </w:r>
+      <w:r>
+        <w:t xml:space="preserve"> </w:t>
+      </w:r>
+      <w:r>
+        <w:t>출력을</w:t>
+      </w:r>
+      <w:r>
+        <w:t xml:space="preserve"> </w:t>
+      </w:r>
+      <w:r>
+        <w:t>사용하며</w:t>
+      </w:r>
+      <w:r>
+        <w:t xml:space="preserve"> </w:t>
+      </w:r>
+      <w:r>
+        <w:t>색과</w:t>
+      </w:r>
+      <w:r>
+        <w:t xml:space="preserve"> </w:t>
+      </w:r>
+      <w:r>
+        <w:t>면적은</w:t>
+      </w:r>
+      <w:r>
+        <w:t xml:space="preserve"> </w:t>
+      </w:r>
+      <w:r>
+        <w:t>원본</w:t>
+      </w:r>
+      <w:r>
+        <w:t xml:space="preserve"> RGB</w:t>
+      </w:r>
+      <w:r>
+        <w:t>에서</w:t>
+      </w:r>
+      <w:r>
+        <w:t xml:space="preserve"> </w:t>
+      </w:r>
+      <w:r>
+        <w:t>측정한다</w:t>
+      </w:r>
+      <w:r>
+        <w:t xml:space="preserve">. </w:t>
+      </w:r>
+      <w:r>
         <w:t>모델</w:t>
       </w:r>
       <w:r>
@@ -7425,6 +7482,72 @@
         <w:t xml:space="preserve">. </w:t>
       </w:r>
       <w:r>
+        <w:t>내부</w:t>
+      </w:r>
+      <w:r>
+        <w:t xml:space="preserve"> </w:t>
+      </w:r>
+      <w:r>
+        <w:t>중간</w:t>
+      </w:r>
+      <w:r>
+        <w:t xml:space="preserve"> </w:t>
+      </w:r>
+      <w:r>
+        <w:t>텐서도</w:t>
+      </w:r>
+      <w:r>
+        <w:t xml:space="preserve"> </w:t>
+      </w:r>
+      <w:r>
+        <w:t>메모리를</w:t>
+      </w:r>
+      <w:r>
+        <w:t xml:space="preserve"> </w:t>
+      </w:r>
+      <w:r>
+        <w:t>사용하므로</w:t>
+      </w:r>
+      <w:r>
+        <w:t xml:space="preserve"> </w:t>
+      </w:r>
+      <w:r>
+        <w:t>파일</w:t>
+      </w:r>
+      <w:r>
+        <w:t xml:space="preserve"> </w:t>
+      </w:r>
+      <w:r>
+        <w:t>크기만으로</w:t>
+      </w:r>
+      <w:r>
+        <w:t xml:space="preserve"> </w:t>
+      </w:r>
+      <w:r>
+        <w:t>실행</w:t>
+      </w:r>
+      <w:r>
+        <w:t xml:space="preserve"> </w:t>
+      </w:r>
+      <w:r>
+        <w:t>비용을</w:t>
+      </w:r>
+      <w:r>
+        <w:t xml:space="preserve"> </w:t>
+      </w:r>
+      <w:r>
+        <w:t>판단하지</w:t>
+      </w:r>
+      <w:r>
+        <w:t xml:space="preserve"> </w:t>
+      </w:r>
+      <w:r>
+        <w:t>않는다</w:t>
+      </w:r>
+      <w:r>
+        <w:t xml:space="preserve">. </w:t>
+      </w:r>
+      <w:r>
         <w:t>앱</w:t>
       </w:r>
       <w:r>
@@ -7458,7 +7581,7 @@
         <w:t>공개하며</w:t>
       </w:r>
       <w:r>
-        <w:t xml:space="preserve">, </w:t>
+        <w:t xml:space="preserve"> </w:t>
       </w:r>
       <w:r>
         <w:t>원본</w:t>
@@ -7492,98 +7615,453 @@
       </w:r>
       <w:r>
         <w:t>제공한다</w:t>
-      </w:r>
-      <w:r>
-        <w:t xml:space="preserve">. </w:t>
-      </w:r>
-      <w:r>
-        <w:t>현재</w:t>
-      </w:r>
-      <w:r>
-        <w:t xml:space="preserve"> </w:t>
-      </w:r>
-      <w:r>
-        <w:t>가중치는</w:t>
-      </w:r>
-      <w:r>
-        <w:t xml:space="preserve"> </w:t>
-      </w:r>
-      <w:r>
-        <w:t>공식</w:t>
-      </w:r>
-      <w:r>
-        <w:t xml:space="preserve"> </w:t>
-      </w:r>
-      <w:r>
-        <w:t>사전학습</w:t>
-      </w:r>
-      <w:r>
-        <w:t xml:space="preserve"> </w:t>
-      </w:r>
-      <w:r>
-        <w:t>모델이며</w:t>
-      </w:r>
-      <w:r>
-        <w:t xml:space="preserve"> </w:t>
-      </w:r>
-      <w:r>
-        <w:t>프로젝트</w:t>
-      </w:r>
-      <w:r>
-        <w:t xml:space="preserve"> </w:t>
-      </w:r>
-      <w:r>
-        <w:t>장면의</w:t>
-      </w:r>
-      <w:r>
-        <w:t xml:space="preserve"> </w:t>
-      </w:r>
-      <w:r>
-        <w:t>파인튜닝은</w:t>
-      </w:r>
-      <w:r>
-        <w:t xml:space="preserve"> </w:t>
-      </w:r>
-      <w:r>
-        <w:t>별도</w:t>
-      </w:r>
-      <w:r>
-        <w:t xml:space="preserve"> </w:t>
-      </w:r>
-      <w:r>
-        <w:t>학습</w:t>
-      </w:r>
-      <w:r>
-        <w:t>·</w:t>
-      </w:r>
-      <w:r>
-        <w:t>평가</w:t>
-      </w:r>
-      <w:r>
-        <w:t xml:space="preserve"> </w:t>
-      </w:r>
-      <w:r>
-        <w:t>단계로</w:t>
-      </w:r>
-      <w:r>
-        <w:t xml:space="preserve"> </w:t>
-      </w:r>
-      <w:r>
-        <w:t>진행한다</w:t>
       </w:r>
       <w:r>
         <w:t>.</w:t>
       </w:r>
     </w:p>
     <w:p>
-      <w:r>
-        <w:t>내비게이션에서는</w:t>
-      </w:r>
-      <w:r>
-        <w:t xml:space="preserve"> </w:t>
-      </w:r>
-      <w:r>
-        <w:t>현재</w:t>
+      <w:pPr>
+        <w:pStyle w:val="21"/>
+        <w:pageBreakBefore/>
+      </w:pPr>
+      <w:r>
+        <w:lastRenderedPageBreak/>
+        <w:t>실제</w:t>
+      </w:r>
+      <w:r>
+        <w:t xml:space="preserve"> </w:t>
+      </w:r>
+      <w:r>
+        <w:t>파인튜닝과</w:t>
+      </w:r>
+      <w:r>
+        <w:t xml:space="preserve"> </w:t>
+      </w:r>
+      <w:r>
+        <w:t>평가</w:t>
+      </w:r>
+    </w:p>
+    <w:p>
+      <w:r>
+        <w:t>원본</w:t>
+      </w:r>
+      <w:r>
+        <w:t xml:space="preserve"> </w:t>
+      </w:r>
+      <w:r>
+        <w:t>영상</w:t>
+      </w:r>
+      <w:r>
+        <w:t xml:space="preserve"> </w:t>
+      </w:r>
+      <w:r>
+        <w:t>단위로</w:t>
+      </w:r>
+      <w:r>
+        <w:t xml:space="preserve"> </w:t>
+      </w:r>
+      <w:r>
+        <w:t>학습</w:t>
+      </w:r>
+      <w:r>
+        <w:t xml:space="preserve"> 12</w:t>
+      </w:r>
+      <w:r>
+        <w:t>장</w:t>
+      </w:r>
+      <w:r>
+        <w:t>·</w:t>
+      </w:r>
+      <w:r>
+        <w:t>검증</w:t>
+      </w:r>
+      <w:r>
+        <w:t xml:space="preserve"> 4</w:t>
+      </w:r>
+      <w:r>
+        <w:t>장</w:t>
+      </w:r>
+      <w:r>
+        <w:t>·</w:t>
+      </w:r>
+      <w:r>
+        <w:t>시험</w:t>
+      </w:r>
+      <w:r>
+        <w:t xml:space="preserve"> 8</w:t>
+      </w:r>
+      <w:r>
+        <w:t>장을</w:t>
+      </w:r>
+      <w:r>
+        <w:t xml:space="preserve"> </w:t>
+      </w:r>
+      <w:r>
+        <w:t>분리하고</w:t>
+      </w:r>
+      <w:r>
+        <w:t xml:space="preserve">, </w:t>
+      </w:r>
+      <w:r>
+        <w:t>실제</w:t>
+      </w:r>
+      <w:r>
+        <w:t xml:space="preserve"> RGB</w:t>
+      </w:r>
+      <w:r>
+        <w:t>를</w:t>
+      </w:r>
+      <w:r>
+        <w:t xml:space="preserve"> </w:t>
+      </w:r>
+      <w:r>
+        <w:t>검토한</w:t>
+      </w:r>
+      <w:r>
+        <w:t xml:space="preserve"> AI </w:t>
+      </w:r>
+      <w:r>
+        <w:t>보조</w:t>
+      </w:r>
+      <w:r>
+        <w:t xml:space="preserve"> </w:t>
+      </w:r>
+      <w:r>
+        <w:t>부분</w:t>
+      </w:r>
+      <w:r>
+        <w:t xml:space="preserve"> </w:t>
+      </w:r>
+      <w:r>
+        <w:t>주석으로</w:t>
+      </w:r>
+      <w:r>
+        <w:t xml:space="preserve"> </w:t>
+      </w:r>
+      <w:r>
+        <w:t>추가</w:t>
+      </w:r>
+      <w:r>
+        <w:t xml:space="preserve"> </w:t>
+      </w:r>
+      <w:r>
+        <w:t>학습했다</w:t>
+      </w:r>
+      <w:r>
+        <w:t xml:space="preserve">. </w:t>
+      </w:r>
+      <w:r>
+        <w:t>명확한</w:t>
+      </w:r>
+      <w:r>
+        <w:t xml:space="preserve"> </w:t>
+      </w:r>
+      <w:r>
+        <w:t>영역만</w:t>
+      </w:r>
+      <w:r>
+        <w:t xml:space="preserve"> </w:t>
+      </w:r>
+      <w:r>
+        <w:t>표시하고</w:t>
+      </w:r>
+      <w:r>
+        <w:t xml:space="preserve"> </w:t>
+      </w:r>
+      <w:r>
+        <w:t>불확실한</w:t>
+      </w:r>
+      <w:r>
+        <w:t xml:space="preserve"> </w:t>
+      </w:r>
+      <w:r>
+        <w:t>픽셀은</w:t>
+      </w:r>
+      <w:r>
+        <w:t xml:space="preserve"> </w:t>
+      </w:r>
+      <w:r>
+        <w:t>학습에서</w:t>
+      </w:r>
+      <w:r>
+        <w:t xml:space="preserve"> </w:t>
+      </w:r>
+      <w:r>
+        <w:t>제외했다</w:t>
+      </w:r>
+      <w:r>
+        <w:t xml:space="preserve">. Ultralytics </w:t>
+      </w:r>
+      <w:r>
+        <w:t>공식</w:t>
+      </w:r>
+      <w:r>
+        <w:t xml:space="preserve"> </w:t>
+      </w:r>
+      <w:r>
+        <w:t>학습기로</w:t>
+      </w:r>
+      <w:r>
+        <w:t xml:space="preserve"> 30</w:t>
+      </w:r>
+      <w:r>
+        <w:t>회</w:t>
+      </w:r>
+      <w:r>
+        <w:t xml:space="preserve"> </w:t>
+      </w:r>
+      <w:r>
+        <w:t>반복</w:t>
+      </w:r>
+      <w:r>
+        <w:t>·180</w:t>
+      </w:r>
+      <w:r>
+        <w:t>회</w:t>
+      </w:r>
+      <w:r>
+        <w:t xml:space="preserve"> </w:t>
+      </w:r>
+      <w:r>
+        <w:t>가중치</w:t>
+      </w:r>
+      <w:r>
+        <w:t xml:space="preserve"> </w:t>
+      </w:r>
+      <w:r>
+        <w:t>갱신을</w:t>
+      </w:r>
+      <w:r>
+        <w:t xml:space="preserve"> </w:t>
+      </w:r>
+      <w:r>
+        <w:t>수행했으며</w:t>
+      </w:r>
+      <w:r>
+        <w:t xml:space="preserve"> </w:t>
+      </w:r>
+      <w:r>
+        <w:t>검증</w:t>
+      </w:r>
+      <w:r>
+        <w:t xml:space="preserve"> </w:t>
+      </w:r>
+      <w:r>
+        <w:t>집합에서</w:t>
+      </w:r>
+      <w:r>
+        <w:t xml:space="preserve"> 2</w:t>
+      </w:r>
+      <w:r>
+        <w:t>회차</w:t>
+      </w:r>
+      <w:r>
+        <w:t xml:space="preserve"> </w:t>
+      </w:r>
+      <w:r>
+        <w:t>모델을</w:t>
+      </w:r>
+      <w:r>
+        <w:t xml:space="preserve"> </w:t>
+      </w:r>
+      <w:r>
+        <w:t>선택했다</w:t>
+      </w:r>
+      <w:r>
+        <w:t xml:space="preserve">. </w:t>
+      </w:r>
+      <w:r>
+        <w:t>초기</w:t>
+      </w:r>
+      <w:r>
+        <w:t xml:space="preserve"> </w:t>
+      </w:r>
+      <w:r>
+        <w:t>대비</w:t>
+      </w:r>
+      <w:r>
+        <w:t xml:space="preserve"> 104</w:t>
+      </w:r>
+      <w:r>
+        <w:t>개</w:t>
+      </w:r>
+      <w:r>
+        <w:t xml:space="preserve"> </w:t>
+      </w:r>
+      <w:r>
+        <w:t>가중치</w:t>
+      </w:r>
+      <w:r>
+        <w:t>·</w:t>
+      </w:r>
+      <w:r>
+        <w:t>통계</w:t>
+      </w:r>
+      <w:r>
+        <w:t xml:space="preserve"> </w:t>
+      </w:r>
+      <w:r>
+        <w:t>텐서가</w:t>
+      </w:r>
+      <w:r>
+        <w:t xml:space="preserve"> </w:t>
+      </w:r>
+      <w:r>
+        <w:t>바뀌었고</w:t>
+      </w:r>
+      <w:r>
+        <w:t xml:space="preserve"> </w:t>
+      </w:r>
+      <w:r>
+        <w:t>실행</w:t>
+      </w:r>
+      <w:r>
+        <w:t xml:space="preserve"> </w:t>
+      </w:r>
+      <w:r>
+        <w:t>설정</w:t>
+      </w:r>
+      <w:r>
+        <w:t>·</w:t>
+      </w:r>
+      <w:r>
+        <w:t>기록</w:t>
+      </w:r>
+      <w:r>
+        <w:t>·</w:t>
+      </w:r>
+      <w:r>
+        <w:t>파일</w:t>
+      </w:r>
+      <w:r>
+        <w:t xml:space="preserve"> </w:t>
+      </w:r>
+      <w:r>
+        <w:t>해시를</w:t>
+      </w:r>
+      <w:r>
+        <w:t xml:space="preserve"> </w:t>
+      </w:r>
+      <w:r>
+        <w:t>보존했다</w:t>
+      </w:r>
+      <w:r>
+        <w:t>.</w:t>
+      </w:r>
+    </w:p>
+    <w:p>
+      <w:pPr>
+        <w:keepNext/>
+        <w:spacing w:after="40" w:line="240" w:lineRule="auto"/>
+      </w:pPr>
+      <w:r>
+        <w:rPr>
+          <w:noProof/>
+        </w:rPr>
+        <w:drawing>
+          <wp:inline distT="0" distB="0" distL="0" distR="0" wp14:anchorId="7A787595" wp14:editId="7A43C452">
+            <wp:extent cx="6400800" cy="2314135"/>
+            <wp:effectExtent l="0" t="0" r="0" b="0"/>
+            <wp:docPr id="3" name="Picture 3"/>
+            <wp:cNvGraphicFramePr>
+              <a:graphicFrameLocks xmlns:a="http://schemas.openxmlformats.org/drawingml/2006/main" noChangeAspect="1"/>
+            </wp:cNvGraphicFramePr>
+            <a:graphic xmlns:a="http://schemas.openxmlformats.org/drawingml/2006/main">
+              <a:graphicData uri="http://schemas.openxmlformats.org/drawingml/2006/picture">
+                <pic:pic xmlns:pic="http://schemas.openxmlformats.org/drawingml/2006/picture">
+                  <pic:nvPicPr>
+                    <pic:cNvPr id="0" name="finetune-pilot01.png"/>
+                    <pic:cNvPicPr/>
+                  </pic:nvPicPr>
+                  <pic:blipFill>
+                    <a:blip r:embed="rId14"/>
+                    <a:stretch>
+                      <a:fillRect/>
+                    </a:stretch>
+                  </pic:blipFill>
+                  <pic:spPr>
+                    <a:xfrm>
+                      <a:off x="0" y="0"/>
+                      <a:ext cx="6400800" cy="2314135"/>
+                    </a:xfrm>
+                    <a:prstGeom prst="rect">
+                      <a:avLst/>
+                    </a:prstGeom>
+                  </pic:spPr>
+                </pic:pic>
+              </a:graphicData>
+            </a:graphic>
+          </wp:inline>
+        </w:drawing>
+      </w:r>
+    </w:p>
+    <w:p>
+      <w:pPr>
+        <w:pStyle w:val="af0"/>
+        <w:spacing w:after="200"/>
+      </w:pPr>
+      <w:r>
+        <w:t>실제</w:t>
+      </w:r>
+      <w:r>
+        <w:t xml:space="preserve"> </w:t>
+      </w:r>
+      <w:r>
+        <w:t>파인튜닝의</w:t>
+      </w:r>
+      <w:r>
+        <w:t xml:space="preserve"> </w:t>
+      </w:r>
+      <w:r>
+        <w:t>학습</w:t>
+      </w:r>
+      <w:r>
+        <w:t xml:space="preserve"> </w:t>
+      </w:r>
+      <w:r>
+        <w:t>곡선과</w:t>
+      </w:r>
+      <w:r>
+        <w:t xml:space="preserve"> </w:t>
+      </w:r>
+      <w:r>
+        <w:t>분리된</w:t>
+      </w:r>
+      <w:r>
+        <w:t xml:space="preserve"> </w:t>
+      </w:r>
+      <w:r>
+        <w:t>시험</w:t>
+      </w:r>
+      <w:r>
+        <w:t xml:space="preserve"> </w:t>
+      </w:r>
+      <w:r>
+        <w:t>결과</w:t>
+      </w:r>
+    </w:p>
+    <w:p>
+      <w:r>
+        <w:t>별도</w:t>
+      </w:r>
+      <w:r>
+        <w:t xml:space="preserve"> </w:t>
+      </w:r>
+      <w:r>
+        <w:t>영상의</w:t>
+      </w:r>
+      <w:r>
+        <w:t xml:space="preserve"> </w:t>
+      </w:r>
+      <w:r>
+        <w:t>시험</w:t>
+      </w:r>
+      <w:r>
+        <w:t xml:space="preserve"> 8</w:t>
+      </w:r>
+      <w:r>
+        <w:t>장에서는</w:t>
       </w:r>
       <w:r>
         <w:t xml:space="preserve"> </w:t>
@@ -7592,70 +8070,288 @@
         <w:t>도로</w:t>
       </w:r>
       <w:r>
-        <w:t xml:space="preserve"> </w:t>
-      </w:r>
-      <w:r>
-        <w:t>종류</w:t>
+        <w:t xml:space="preserve"> IoU</w:t>
+      </w:r>
+      <w:r>
+        <w:t>가</w:t>
+      </w:r>
+      <w:r>
+        <w:t xml:space="preserve"> 70.47%→79.80%</w:t>
+      </w:r>
+      <w:r>
+        <w:t>로</w:t>
+      </w:r>
+      <w:r>
+        <w:t xml:space="preserve"> </w:t>
+      </w:r>
+      <w:r>
+        <w:t>높아졌지만</w:t>
+      </w:r>
+      <w:r>
+        <w:t xml:space="preserve"> </w:t>
+      </w:r>
+      <w:r>
+        <w:t>보도는</w:t>
+      </w:r>
+      <w:r>
+        <w:t xml:space="preserve"> 62.80%→39.51%</w:t>
+      </w:r>
+      <w:r>
+        <w:t>로</w:t>
+      </w:r>
+      <w:r>
+        <w:t xml:space="preserve"> </w:t>
+      </w:r>
+      <w:r>
+        <w:t>낮아졌다</w:t>
+      </w:r>
+      <w:r>
+        <w:t xml:space="preserve">. </w:t>
+      </w:r>
+      <w:r>
+        <w:t>정답이</w:t>
+      </w:r>
+      <w:r>
+        <w:t xml:space="preserve"> </w:t>
+      </w:r>
+      <w:r>
+        <w:t>있는</w:t>
+      </w:r>
+      <w:r>
+        <w:t xml:space="preserve"> 8</w:t>
+      </w:r>
+      <w:r>
+        <w:t>개</w:t>
+      </w:r>
+      <w:r>
+        <w:t xml:space="preserve"> </w:t>
+      </w:r>
+      <w:r>
+        <w:t>클래스</w:t>
+      </w:r>
+      <w:r>
+        <w:t xml:space="preserve"> </w:t>
+      </w:r>
+      <w:r>
+        <w:t>평균</w:t>
+      </w:r>
+      <w:r>
+        <w:t xml:space="preserve"> IoU</w:t>
+      </w:r>
+      <w:r>
+        <w:t>도</w:t>
+      </w:r>
+      <w:r>
+        <w:t xml:space="preserve"> 60.44%→58.76%</w:t>
+      </w:r>
+      <w:r>
+        <w:t>로</w:t>
+      </w:r>
+      <w:r>
+        <w:t xml:space="preserve"> </w:t>
+      </w:r>
+      <w:r>
+        <w:t>내려가</w:t>
+      </w:r>
+      <w:r>
+        <w:t xml:space="preserve"> </w:t>
+      </w:r>
+      <w:r>
+        <w:t>기본</w:t>
+      </w:r>
+      <w:r>
+        <w:t xml:space="preserve"> </w:t>
+      </w:r>
+      <w:r>
+        <w:t>모델은</w:t>
+      </w:r>
+      <w:r>
+        <w:t xml:space="preserve"> </w:t>
+      </w:r>
+      <w:r>
+        <w:t>공식</w:t>
+      </w:r>
+      <w:r>
+        <w:t xml:space="preserve"> </w:t>
+      </w:r>
+      <w:r>
+        <w:t>가중치를</w:t>
+      </w:r>
+      <w:r>
+        <w:t xml:space="preserve"> </w:t>
+      </w:r>
+      <w:r>
+        <w:t>유지했다</w:t>
+      </w:r>
+      <w:r>
+        <w:t xml:space="preserve">. </w:t>
+      </w:r>
+      <w:r>
+        <w:t>부분</w:t>
+      </w:r>
+      <w:r>
+        <w:t xml:space="preserve"> </w:t>
+      </w:r>
+      <w:r>
+        <w:t>주석</w:t>
+      </w:r>
+      <w:r>
+        <w:t xml:space="preserve"> </w:t>
+      </w:r>
+      <w:r>
+        <w:t>표본의</w:t>
+      </w:r>
+      <w:r>
+        <w:t xml:space="preserve"> </w:t>
+      </w:r>
+      <w:r>
+        <w:t>결과이며</w:t>
       </w:r>
       <w:r>
         <w:t xml:space="preserve">, </w:t>
       </w:r>
       <w:r>
-        <w:t>경로</w:t>
-      </w:r>
-      <w:r>
-        <w:t xml:space="preserve"> </w:t>
-      </w:r>
-      <w:r>
-        <w:t>옵션</w:t>
-      </w:r>
-      <w:r>
-        <w:t xml:space="preserve">, </w:t>
-      </w:r>
-      <w:r>
-        <w:t>차량</w:t>
-      </w:r>
-      <w:r>
-        <w:t xml:space="preserve"> </w:t>
-      </w:r>
-      <w:r>
-        <w:t>진행</w:t>
-      </w:r>
-      <w:r>
-        <w:t xml:space="preserve"> </w:t>
-      </w:r>
-      <w:r>
-        <w:t>방향과</w:t>
-      </w:r>
-      <w:r>
-        <w:t xml:space="preserve"> </w:t>
-      </w:r>
-      <w:r>
-        <w:t>카메라</w:t>
-      </w:r>
-      <w:r>
-        <w:t xml:space="preserve"> </w:t>
-      </w:r>
-      <w:r>
-        <w:t>시선</w:t>
-      </w:r>
-      <w:r>
-        <w:t xml:space="preserve"> </w:t>
-      </w:r>
-      <w:r>
-        <w:t>방향을</w:t>
-      </w:r>
-      <w:r>
-        <w:t xml:space="preserve"> </w:t>
-      </w:r>
-      <w:r>
-        <w:t>구별해</w:t>
-      </w:r>
-      <w:r>
-        <w:t xml:space="preserve"> </w:t>
-      </w:r>
-      <w:r>
-        <w:t>사용한다</w:t>
+        <w:t>다음</w:t>
+      </w:r>
+      <w:r>
+        <w:t xml:space="preserve"> </w:t>
+      </w:r>
+      <w:r>
+        <w:t>실험에서는</w:t>
+      </w:r>
+      <w:r>
+        <w:t xml:space="preserve"> </w:t>
+      </w:r>
+      <w:r>
+        <w:t>창문</w:t>
+      </w:r>
+      <w:r>
+        <w:t>·</w:t>
+      </w:r>
+      <w:r>
+        <w:t>간판</w:t>
+      </w:r>
+      <w:r>
+        <w:t>·</w:t>
+      </w:r>
+      <w:r>
+        <w:t>보도</w:t>
+      </w:r>
+      <w:r>
+        <w:t xml:space="preserve"> </w:t>
+      </w:r>
+      <w:r>
+        <w:t>주석과</w:t>
+      </w:r>
+      <w:r>
+        <w:t xml:space="preserve"> </w:t>
+      </w:r>
+      <w:r>
+        <w:t>새로운</w:t>
+      </w:r>
+      <w:r>
+        <w:t xml:space="preserve"> </w:t>
+      </w:r>
+      <w:r>
+        <w:t>원본</w:t>
+      </w:r>
+      <w:r>
+        <w:t xml:space="preserve"> </w:t>
+      </w:r>
+      <w:r>
+        <w:t>영상을</w:t>
+      </w:r>
+      <w:r>
+        <w:t xml:space="preserve"> </w:t>
+      </w:r>
+      <w:r>
+        <w:t>보강한다</w:t>
+      </w:r>
+      <w:r>
+        <w:t xml:space="preserve">. </w:t>
+      </w:r>
+      <w:hyperlink r:id="rId15">
+        <w:r>
+          <w:rPr>
+            <w:color w:val="245C7A"/>
+          </w:rPr>
+          <w:t>학습</w:t>
+        </w:r>
+        <w:r>
+          <w:rPr>
+            <w:color w:val="245C7A"/>
+          </w:rPr>
+          <w:t xml:space="preserve"> </w:t>
+        </w:r>
+        <w:r>
+          <w:rPr>
+            <w:color w:val="245C7A"/>
+          </w:rPr>
+          <w:t>과정과</w:t>
+        </w:r>
+        <w:r>
+          <w:rPr>
+            <w:color w:val="245C7A"/>
+          </w:rPr>
+          <w:t xml:space="preserve"> </w:t>
+        </w:r>
+        <w:r>
+          <w:rPr>
+            <w:color w:val="245C7A"/>
+          </w:rPr>
+          <w:t>평가</w:t>
+        </w:r>
+        <w:r>
+          <w:rPr>
+            <w:color w:val="245C7A"/>
+          </w:rPr>
+          <w:t xml:space="preserve"> </w:t>
+        </w:r>
+        <w:r>
+          <w:rPr>
+            <w:color w:val="245C7A"/>
+          </w:rPr>
+          <w:t>원장</w:t>
+        </w:r>
+      </w:hyperlink>
+      <w:r>
+        <w:t>에</w:t>
+      </w:r>
+      <w:r>
+        <w:t xml:space="preserve"> </w:t>
+      </w:r>
+      <w:r>
+        <w:t>전후</w:t>
+      </w:r>
+      <w:r>
+        <w:t xml:space="preserve"> </w:t>
+      </w:r>
+      <w:r>
+        <w:t>수치와</w:t>
+      </w:r>
+      <w:r>
+        <w:t xml:space="preserve"> </w:t>
+      </w:r>
+      <w:r>
+        <w:t>실제</w:t>
+      </w:r>
+      <w:r>
+        <w:t xml:space="preserve"> </w:t>
+      </w:r>
+      <w:r>
+        <w:t>학습</w:t>
+      </w:r>
+      <w:r>
+        <w:t xml:space="preserve"> </w:t>
+      </w:r>
+      <w:r>
+        <w:t>증거를</w:t>
+      </w:r>
+      <w:r>
+        <w:t xml:space="preserve"> </w:t>
+      </w:r>
+      <w:r>
+        <w:t>정리했다</w:t>
       </w:r>
       <w:r>
         <w:t>.</w:t>
@@ -7688,16 +8384,28 @@
     </w:p>
     <w:p>
       <w:r>
-        <w:t>Pleos Connect</w:t>
-      </w:r>
-      <w:r>
-        <w:t>는</w:t>
-      </w:r>
-      <w:r>
-        <w:t xml:space="preserve"> Android Automotive </w:t>
-      </w:r>
-      <w:r>
-        <w:t>기반</w:t>
+        <w:t>Driving Mood</w:t>
+      </w:r>
+      <w:r>
+        <w:t>의</w:t>
+      </w:r>
+      <w:r>
+        <w:t xml:space="preserve"> </w:t>
+      </w:r>
+      <w:r>
+        <w:t>최종</w:t>
+      </w:r>
+      <w:r>
+        <w:t xml:space="preserve"> </w:t>
+      </w:r>
+      <w:r>
+        <w:t>실행</w:t>
+      </w:r>
+      <w:r>
+        <w:t xml:space="preserve"> </w:t>
+      </w:r>
+      <w:r>
+        <w:t>환경은</w:t>
       </w:r>
       <w:r>
         <w:t xml:space="preserve"> </w:t>
@@ -7709,85 +8417,223 @@
         <w:t xml:space="preserve"> </w:t>
       </w:r>
       <w:r>
-        <w:t>인포테인먼트</w:t>
-      </w:r>
-      <w:r>
-        <w:t xml:space="preserve"> </w:t>
-      </w:r>
-      <w:r>
-        <w:t>플랫폼이다</w:t>
-      </w:r>
-      <w:r>
-        <w:t>.[1] NaviHelper</w:t>
-      </w:r>
-      <w:r>
-        <w:t>와</w:t>
-      </w:r>
-      <w:r>
-        <w:t xml:space="preserve"> Vehicle SDK</w:t>
+        <w:t>인포테인먼트다</w:t>
+      </w:r>
+      <w:r>
+        <w:t>. Pleos Connect</w:t>
       </w:r>
       <w:r>
         <w:t>의</w:t>
       </w:r>
       <w:r>
-        <w:t xml:space="preserve"> </w:t>
-      </w:r>
-      <w:r>
-        <w:t>입력</w:t>
+        <w:t xml:space="preserve"> Android </w:t>
+      </w:r>
+      <w:r>
+        <w:t>기반을</w:t>
+      </w:r>
+      <w:r>
+        <w:t xml:space="preserve"> </w:t>
+      </w:r>
+      <w:r>
+        <w:t>활용해</w:t>
+      </w:r>
+      <w:r>
+        <w:t xml:space="preserve"> </w:t>
+      </w:r>
+      <w:r>
+        <w:t>무드</w:t>
+      </w:r>
+      <w:r>
+        <w:t xml:space="preserve"> </w:t>
+      </w:r>
+      <w:r>
+        <w:t>계산을</w:t>
+      </w:r>
+      <w:r>
+        <w:t xml:space="preserve"> </w:t>
+      </w:r>
+      <w:r>
+        <w:t>재사용하고</w:t>
+      </w:r>
+      <w:r>
+        <w:t xml:space="preserve">, </w:t>
+      </w:r>
+      <w:r>
+        <w:t>카메라</w:t>
       </w:r>
       <w:r>
         <w:t>·</w:t>
       </w:r>
       <w:r>
-        <w:t>제어</w:t>
-      </w:r>
-      <w:r>
-        <w:t xml:space="preserve"> </w:t>
-      </w:r>
-      <w:r>
-        <w:t>경로를</w:t>
-      </w:r>
-      <w:r>
-        <w:t xml:space="preserve"> </w:t>
-      </w:r>
-      <w:r>
-        <w:t>활용하고</w:t>
+        <w:t>내비게이션</w:t>
+      </w:r>
+      <w:r>
+        <w:t xml:space="preserve"> </w:t>
+      </w:r>
+      <w:r>
+        <w:t>입력과</w:t>
+      </w:r>
+      <w:r>
+        <w:t xml:space="preserve"> </w:t>
+      </w:r>
+      <w:r>
+        <w:t>음악</w:t>
+      </w:r>
+      <w:r>
+        <w:t>·</w:t>
+      </w:r>
+      <w:r>
+        <w:t>조명</w:t>
+      </w:r>
+      <w:r>
+        <w:t xml:space="preserve"> </w:t>
+      </w:r>
+      <w:r>
+        <w:t>출력을</w:t>
+      </w:r>
+      <w:r>
+        <w:t xml:space="preserve"> </w:t>
+      </w:r>
+      <w:r>
+        <w:t>차량용</w:t>
+      </w:r>
+      <w:r>
+        <w:t xml:space="preserve"> </w:t>
+      </w:r>
+      <w:r>
+        <w:t>연결부로</w:t>
+      </w:r>
+      <w:r>
+        <w:t xml:space="preserve"> </w:t>
+      </w:r>
+      <w:r>
+        <w:t>바꾼다</w:t>
+      </w:r>
+      <w:r>
+        <w:t xml:space="preserve">.[1] </w:t>
+      </w:r>
+      <w:r>
+        <w:t>현재</w:t>
+      </w:r>
+      <w:r>
+        <w:t xml:space="preserve"> </w:t>
+      </w:r>
+      <w:r>
+        <w:t>숫자</w:t>
+      </w:r>
+      <w:r>
+        <w:t xml:space="preserve"> </w:t>
+      </w:r>
+      <w:r>
+        <w:t>중심</w:t>
+      </w:r>
+      <w:r>
+        <w:t xml:space="preserve"> </w:t>
+      </w:r>
+      <w:r>
+        <w:t>점수기는</w:t>
+      </w:r>
+      <w:r>
+        <w:t xml:space="preserve"> </w:t>
+      </w:r>
+      <w:r>
+        <w:t>분리되어</w:t>
+      </w:r>
+      <w:r>
+        <w:t xml:space="preserve"> </w:t>
+      </w:r>
+      <w:r>
+        <w:t>있지만</w:t>
+      </w:r>
+      <w:r>
+        <w:t xml:space="preserve"> </w:t>
+      </w:r>
+      <w:r>
+        <w:t>영상</w:t>
+      </w:r>
+      <w:r>
+        <w:t>·</w:t>
+      </w:r>
+      <w:r>
+        <w:t>음원</w:t>
+      </w:r>
+      <w:r>
+        <w:t xml:space="preserve"> </w:t>
+      </w:r>
+      <w:r>
+        <w:t>계약에는</w:t>
+      </w:r>
+      <w:r>
+        <w:t xml:space="preserve"> Bitmap·Uri </w:t>
+      </w:r>
+      <w:r>
+        <w:t>참조가</w:t>
+      </w:r>
+      <w:r>
+        <w:t xml:space="preserve"> </w:t>
+      </w:r>
+      <w:r>
+        <w:t>남아</w:t>
+      </w:r>
+      <w:r>
+        <w:t xml:space="preserve"> </w:t>
+      </w:r>
+      <w:r>
+        <w:t>있어</w:t>
       </w:r>
       <w:r>
         <w:t xml:space="preserve">, </w:t>
       </w:r>
       <w:r>
-        <w:t>프로젝트</w:t>
-      </w:r>
-      <w:r>
-        <w:t xml:space="preserve"> </w:t>
-      </w:r>
-      <w:r>
-        <w:t>권한과</w:t>
-      </w:r>
-      <w:r>
-        <w:t xml:space="preserve"> </w:t>
-      </w:r>
-      <w:r>
-        <w:t>차종별</w:t>
-      </w:r>
-      <w:r>
-        <w:t xml:space="preserve"> </w:t>
-      </w:r>
-      <w:r>
-        <w:t>지원</w:t>
-      </w:r>
-      <w:r>
-        <w:t xml:space="preserve"> </w:t>
-      </w:r>
-      <w:r>
-        <w:t>범위를</w:t>
-      </w:r>
-      <w:r>
-        <w:t xml:space="preserve"> </w:t>
-      </w:r>
-      <w:r>
-        <w:t>확인한다</w:t>
+        <w:t>차량</w:t>
+      </w:r>
+      <w:r>
+        <w:t xml:space="preserve"> </w:t>
+      </w:r>
+      <w:r>
+        <w:t>모듈을</w:t>
+      </w:r>
+      <w:r>
+        <w:t xml:space="preserve"> </w:t>
+      </w:r>
+      <w:r>
+        <w:t>만들</w:t>
+      </w:r>
+      <w:r>
+        <w:t xml:space="preserve"> </w:t>
+      </w:r>
+      <w:r>
+        <w:t>때</w:t>
+      </w:r>
+      <w:r>
+        <w:t xml:space="preserve"> </w:t>
+      </w:r>
+      <w:r>
+        <w:t>자원</w:t>
+      </w:r>
+      <w:r>
+        <w:t xml:space="preserve"> </w:t>
+      </w:r>
+      <w:r>
+        <w:t>관리</w:t>
+      </w:r>
+      <w:r>
+        <w:t xml:space="preserve"> </w:t>
+      </w:r>
+      <w:r>
+        <w:t>경계를</w:t>
+      </w:r>
+      <w:r>
+        <w:t xml:space="preserve"> </w:t>
+      </w:r>
+      <w:r>
+        <w:t>함께</w:t>
+      </w:r>
+      <w:r>
+        <w:t xml:space="preserve"> </w:t>
+      </w:r>
+      <w:r>
+        <w:t>정리한다</w:t>
       </w:r>
       <w:r>
         <w:t>.</w:t>
@@ -9450,91 +10296,519 @@
     </w:p>
     <w:p>
       <w:r>
+        <w:t>차량</w:t>
+      </w:r>
+      <w:r>
+        <w:t xml:space="preserve"> </w:t>
+      </w:r>
+      <w:r>
+        <w:t>빌드는</w:t>
+      </w:r>
+      <w:r>
+        <w:t xml:space="preserve"> </w:t>
+      </w:r>
+      <w:r>
+        <w:t>공식</w:t>
+      </w:r>
+      <w:r>
+        <w:t xml:space="preserve"> </w:t>
+      </w:r>
+      <w:r>
+        <w:t>가이드에</w:t>
+      </w:r>
+      <w:r>
+        <w:t xml:space="preserve"> </w:t>
+      </w:r>
+      <w:r>
+        <w:t>따라</w:t>
+      </w:r>
+      <w:r>
+        <w:t xml:space="preserve"> minSdk 28 </w:t>
+      </w:r>
+      <w:r>
+        <w:t>이상으로</w:t>
+      </w:r>
+      <w:r>
+        <w:t xml:space="preserve"> </w:t>
+      </w:r>
+      <w:r>
+        <w:t>구성하고</w:t>
+      </w:r>
+      <w:r>
+        <w:t xml:space="preserve"> API 34 Pleos </w:t>
+      </w:r>
+      <w:r>
+        <w:t>에뮬레이터에서</w:t>
+      </w:r>
+      <w:r>
+        <w:t xml:space="preserve"> </w:t>
+      </w:r>
+      <w:r>
+        <w:t>설치</w:t>
+      </w:r>
+      <w:r>
+        <w:t>·</w:t>
+      </w:r>
+      <w:r>
+        <w:t>모델</w:t>
+      </w:r>
+      <w:r>
+        <w:t xml:space="preserve"> </w:t>
+      </w:r>
+      <w:r>
+        <w:t>로딩</w:t>
+      </w:r>
+      <w:r>
+        <w:t>·</w:t>
+      </w:r>
+      <w:r>
+        <w:t>서비스</w:t>
+      </w:r>
+      <w:r>
+        <w:t xml:space="preserve"> </w:t>
+      </w:r>
+      <w:r>
+        <w:t>연결을</w:t>
+      </w:r>
+      <w:r>
+        <w:t xml:space="preserve"> </w:t>
+      </w:r>
+      <w:r>
+        <w:t>확인한다</w:t>
+      </w:r>
+      <w:r>
+        <w:t>.[9] NaviHelper</w:t>
+      </w:r>
+      <w:r>
+        <w:t>의</w:t>
+      </w:r>
+      <w:r>
+        <w:t xml:space="preserve"> </w:t>
+      </w:r>
+      <w:r>
+        <w:t>위치</w:t>
+      </w:r>
+      <w:r>
+        <w:t>·</w:t>
+      </w:r>
+      <w:r>
+        <w:t>경로</w:t>
+      </w:r>
+      <w:r>
+        <w:t xml:space="preserve"> </w:t>
+      </w:r>
+      <w:r>
+        <w:t>입력부터</w:t>
+      </w:r>
+      <w:r>
+        <w:t xml:space="preserve"> </w:t>
+      </w:r>
+      <w:r>
+        <w:t>연결하며</w:t>
+      </w:r>
+      <w:r>
+        <w:t xml:space="preserve">, </w:t>
+      </w:r>
+      <w:r>
+        <w:t>점포</w:t>
+      </w:r>
+      <w:r>
+        <w:t xml:space="preserve"> </w:t>
+      </w:r>
+      <w:r>
+        <w:t>영업시간</w:t>
+      </w:r>
+      <w:r>
+        <w:t xml:space="preserve"> </w:t>
+      </w:r>
+      <w:r>
+        <w:t>제공과</w:t>
+      </w:r>
+      <w:r>
+        <w:t xml:space="preserve"> </w:t>
+      </w:r>
+      <w:r>
+        <w:t>영상</w:t>
+      </w:r>
+      <w:r>
+        <w:t xml:space="preserve"> </w:t>
+      </w:r>
+      <w:r>
+        <w:t>속</w:t>
+      </w:r>
+      <w:r>
+        <w:t xml:space="preserve"> </w:t>
+      </w:r>
+      <w:r>
+        <w:t>간판의</w:t>
+      </w:r>
+      <w:r>
+        <w:t xml:space="preserve"> </w:t>
+      </w:r>
+      <w:r>
+        <w:t>점포</w:t>
+      </w:r>
+      <w:r>
+        <w:t xml:space="preserve"> </w:t>
+      </w:r>
+      <w:r>
+        <w:t>대응은</w:t>
+      </w:r>
+      <w:r>
+        <w:t xml:space="preserve"> </w:t>
+      </w:r>
+      <w:r>
+        <w:t>별도</w:t>
+      </w:r>
+      <w:r>
+        <w:t xml:space="preserve"> </w:t>
+      </w:r>
+      <w:r>
+        <w:t>확인한다</w:t>
+      </w:r>
+      <w:r>
+        <w:t>. Galaxy S25+</w:t>
+      </w:r>
+      <w:r>
+        <w:t>의</w:t>
+      </w:r>
+      <w:r>
+        <w:t xml:space="preserve"> </w:t>
+      </w:r>
+      <w:r>
+        <w:t>성능</w:t>
+      </w:r>
+      <w:r>
+        <w:t xml:space="preserve"> </w:t>
+      </w:r>
+      <w:r>
+        <w:t>측정은</w:t>
+      </w:r>
+      <w:r>
+        <w:t xml:space="preserve"> </w:t>
+      </w:r>
+      <w:r>
+        <w:t>휴대폰</w:t>
+      </w:r>
+      <w:r>
+        <w:t xml:space="preserve"> </w:t>
+      </w:r>
+      <w:r>
+        <w:t>검증에</w:t>
+      </w:r>
+      <w:r>
+        <w:t xml:space="preserve"> </w:t>
+      </w:r>
+      <w:r>
+        <w:t>사용하고</w:t>
+      </w:r>
+      <w:r>
+        <w:t xml:space="preserve">, </w:t>
+      </w:r>
+      <w:r>
+        <w:t>차량에서는</w:t>
+      </w:r>
+      <w:r>
+        <w:t xml:space="preserve"> </w:t>
+      </w:r>
+      <w:r>
+        <w:t>처리</w:t>
+      </w:r>
+      <w:r>
+        <w:t xml:space="preserve"> </w:t>
+      </w:r>
+      <w:r>
+        <w:t>지연</w:t>
+      </w:r>
+      <w:r>
+        <w:t>·</w:t>
+      </w:r>
+      <w:r>
+        <w:t>최대</w:t>
+      </w:r>
+      <w:r>
+        <w:t xml:space="preserve"> </w:t>
+      </w:r>
+      <w:r>
+        <w:t>메모리</w:t>
+      </w:r>
+      <w:r>
+        <w:t>·</w:t>
+      </w:r>
+      <w:r>
+        <w:t>발열을</w:t>
+      </w:r>
+      <w:r>
+        <w:t xml:space="preserve"> </w:t>
+      </w:r>
+      <w:r>
+        <w:t>다시</w:t>
+      </w:r>
+      <w:r>
+        <w:t xml:space="preserve"> </w:t>
+      </w:r>
+      <w:r>
+        <w:t>측정한다</w:t>
+      </w:r>
+      <w:r>
+        <w:t>.</w:t>
+      </w:r>
+    </w:p>
+    <w:p>
+      <w:r>
+        <w:t>이식은</w:t>
+      </w:r>
+      <w:r>
+        <w:t xml:space="preserve"> </w:t>
+      </w:r>
+      <w:r>
+        <w:t>공통</w:t>
+      </w:r>
+      <w:r>
+        <w:t xml:space="preserve"> </w:t>
+      </w:r>
+      <w:r>
+        <w:t>계산</w:t>
+      </w:r>
+      <w:r>
+        <w:t xml:space="preserve"> </w:t>
+      </w:r>
+      <w:r>
+        <w:t>계약</w:t>
+      </w:r>
+      <w:r>
+        <w:t xml:space="preserve"> </w:t>
+      </w:r>
+      <w:r>
+        <w:t>고정</w:t>
+      </w:r>
+      <w:r>
+        <w:t xml:space="preserve"> → </w:t>
+      </w:r>
+      <w:r>
+        <w:t>차량</w:t>
+      </w:r>
+      <w:r>
+        <w:t xml:space="preserve"> </w:t>
+      </w:r>
+      <w:r>
+        <w:t>빌드</w:t>
+      </w:r>
+      <w:r>
+        <w:t>·</w:t>
+      </w:r>
+      <w:r>
         <w:t>내비게이션</w:t>
       </w:r>
       <w:r>
         <w:t xml:space="preserve"> </w:t>
       </w:r>
       <w:r>
-        <w:t>연결은</w:t>
-      </w:r>
-      <w:r>
-        <w:t xml:space="preserve"> </w:t>
-      </w:r>
-      <w:r>
-        <w:t>공식</w:t>
-      </w:r>
-      <w:r>
-        <w:t xml:space="preserve"> </w:t>
-      </w:r>
-      <w:r>
-        <w:t>샘플을</w:t>
-      </w:r>
-      <w:r>
-        <w:t xml:space="preserve"> </w:t>
-      </w:r>
-      <w:r>
-        <w:t>참고해</w:t>
-      </w:r>
-      <w:r>
-        <w:t xml:space="preserve"> </w:t>
-      </w:r>
-      <w:r>
-        <w:t>이벤트</w:t>
+        <w:t>연결</w:t>
+      </w:r>
+      <w:r>
+        <w:t xml:space="preserve"> → </w:t>
+      </w:r>
+      <w:r>
+        <w:t>주행</w:t>
+      </w:r>
+      <w:r>
+        <w:t xml:space="preserve"> </w:t>
+      </w:r>
+      <w:r>
+        <w:t>제한</w:t>
       </w:r>
       <w:r>
         <w:t>·</w:t>
       </w:r>
       <w:r>
-        <w:t>누락</w:t>
+        <w:t>오디오</w:t>
       </w:r>
       <w:r>
         <w:t>·</w:t>
       </w:r>
       <w:r>
-        <w:t>재연결을</w:t>
-      </w:r>
-      <w:r>
-        <w:t xml:space="preserve"> </w:t>
-      </w:r>
-      <w:r>
-        <w:t>검증한다</w:t>
-      </w:r>
-      <w:r>
-        <w:t xml:space="preserve">.[9] </w:t>
-      </w:r>
-      <w:r>
-        <w:t>적용</w:t>
-      </w:r>
-      <w:r>
-        <w:t xml:space="preserve"> </w:t>
-      </w:r>
-      <w:r>
-        <w:t>대상은</w:t>
-      </w:r>
-      <w:r>
-        <w:t xml:space="preserve"> </w:t>
-      </w:r>
-      <w:r>
-        <w:t>필요한</w:t>
-      </w:r>
-      <w:r>
-        <w:t xml:space="preserve"> </w:t>
-      </w:r>
-      <w:r>
-        <w:t>기능이</w:t>
-      </w:r>
-      <w:r>
-        <w:t xml:space="preserve"> </w:t>
-      </w:r>
-      <w:r>
-        <w:t>지원되는</w:t>
-      </w:r>
-      <w:r>
-        <w:t xml:space="preserve"> Pleos Connect </w:t>
-      </w:r>
-      <w:r>
-        <w:t>차량이다</w:t>
+        <w:t>절전</w:t>
+      </w:r>
+      <w:r>
+        <w:t xml:space="preserve"> </w:t>
+      </w:r>
+      <w:r>
+        <w:t>복귀</w:t>
+      </w:r>
+      <w:r>
+        <w:t xml:space="preserve"> </w:t>
+      </w:r>
+      <w:r>
+        <w:t>검증</w:t>
+      </w:r>
+      <w:r>
+        <w:t xml:space="preserve"> → </w:t>
+      </w:r>
+      <w:r>
+        <w:t>승인된</w:t>
+      </w:r>
+      <w:r>
+        <w:t xml:space="preserve"> </w:t>
+      </w:r>
+      <w:r>
+        <w:t>카메라</w:t>
+      </w:r>
+      <w:r>
+        <w:t>·</w:t>
+      </w:r>
+      <w:r>
+        <w:t>조명</w:t>
+      </w:r>
+      <w:r>
+        <w:t xml:space="preserve"> </w:t>
+      </w:r>
+      <w:r>
+        <w:t>연결</w:t>
+      </w:r>
+      <w:r>
+        <w:t xml:space="preserve"> </w:t>
+      </w:r>
+      <w:r>
+        <w:t>순서로</w:t>
+      </w:r>
+      <w:r>
+        <w:t xml:space="preserve"> </w:t>
+      </w:r>
+      <w:r>
+        <w:t>진행한다</w:t>
+      </w:r>
+      <w:r>
+        <w:t xml:space="preserve">. </w:t>
+      </w:r>
+      <w:r>
+        <w:t>상세</w:t>
+      </w:r>
+      <w:r>
+        <w:t xml:space="preserve"> </w:t>
+      </w:r>
+      <w:r>
+        <w:t>영상과</w:t>
+      </w:r>
+      <w:r>
+        <w:t xml:space="preserve"> </w:t>
+      </w:r>
+      <w:r>
+        <w:t>분석</w:t>
+      </w:r>
+      <w:r>
+        <w:t xml:space="preserve"> </w:t>
+      </w:r>
+      <w:r>
+        <w:t>근거는</w:t>
+      </w:r>
+      <w:r>
+        <w:t xml:space="preserve"> </w:t>
+      </w:r>
+      <w:r>
+        <w:t>주차</w:t>
+      </w:r>
+      <w:r>
+        <w:t xml:space="preserve"> </w:t>
+      </w:r>
+      <w:r>
+        <w:t>중</w:t>
+      </w:r>
+      <w:r>
+        <w:t xml:space="preserve"> </w:t>
+      </w:r>
+      <w:r>
+        <w:t>화면으로</w:t>
+      </w:r>
+      <w:r>
+        <w:t xml:space="preserve"> </w:t>
+      </w:r>
+      <w:r>
+        <w:t>제공하고</w:t>
+      </w:r>
+      <w:r>
+        <w:t xml:space="preserve">, </w:t>
+      </w:r>
+      <w:r>
+        <w:t>주행</w:t>
+      </w:r>
+      <w:r>
+        <w:t xml:space="preserve"> </w:t>
+      </w:r>
+      <w:r>
+        <w:t>중에는</w:t>
+      </w:r>
+      <w:r>
+        <w:t xml:space="preserve"> </w:t>
+      </w:r>
+      <w:r>
+        <w:t>차량의</w:t>
+      </w:r>
+      <w:r>
+        <w:t xml:space="preserve"> UI </w:t>
+      </w:r>
+      <w:r>
+        <w:t>제한에</w:t>
+      </w:r>
+      <w:r>
+        <w:t xml:space="preserve"> </w:t>
+      </w:r>
+      <w:r>
+        <w:t>맞춰</w:t>
+      </w:r>
+      <w:r>
+        <w:t xml:space="preserve"> </w:t>
+      </w:r>
+      <w:r>
+        <w:t>결과와</w:t>
+      </w:r>
+      <w:r>
+        <w:t xml:space="preserve"> </w:t>
+      </w:r>
+      <w:r>
+        <w:t>조작을</w:t>
+      </w:r>
+      <w:r>
+        <w:t xml:space="preserve"> </w:t>
+      </w:r>
+      <w:r>
+        <w:t>줄인다</w:t>
+      </w:r>
+      <w:r>
+        <w:t xml:space="preserve">.[10] </w:t>
+      </w:r>
+      <w:r>
+        <w:t>현재까지의</w:t>
+      </w:r>
+      <w:r>
+        <w:t xml:space="preserve"> </w:t>
+      </w:r>
+      <w:r>
+        <w:t>실행</w:t>
+      </w:r>
+      <w:r>
+        <w:t xml:space="preserve"> </w:t>
+      </w:r>
+      <w:r>
+        <w:t>검증은</w:t>
+      </w:r>
+      <w:r>
+        <w:t xml:space="preserve"> Android </w:t>
+      </w:r>
+      <w:r>
+        <w:t>휴대폰</w:t>
+      </w:r>
+      <w:r>
+        <w:t xml:space="preserve"> </w:t>
+      </w:r>
+      <w:r>
+        <w:t>프로토타입</w:t>
+      </w:r>
+      <w:r>
+        <w:t xml:space="preserve"> </w:t>
+      </w:r>
+      <w:r>
+        <w:t>범위다</w:t>
       </w:r>
       <w:r>
         <w:t>.</w:t>
@@ -11702,34 +12976,58 @@
         <w:t xml:space="preserve">. </w:t>
       </w:r>
       <w:r>
-        <w:t>다음</w:t>
-      </w:r>
-      <w:r>
-        <w:t xml:space="preserve"> </w:t>
-      </w:r>
-      <w:r>
-        <w:t>단계는</w:t>
-      </w:r>
-      <w:r>
-        <w:t xml:space="preserve"> </w:t>
-      </w:r>
-      <w:r>
-        <w:t>프로젝트</w:t>
-      </w:r>
-      <w:r>
-        <w:t xml:space="preserve"> </w:t>
-      </w:r>
-      <w:r>
-        <w:t>장면의</w:t>
-      </w:r>
-      <w:r>
-        <w:t xml:space="preserve"> </w:t>
-      </w:r>
-      <w:r>
-        <w:t>파인튜닝과</w:t>
-      </w:r>
-      <w:r>
-        <w:t xml:space="preserve"> </w:t>
+        <w:t>첫</w:t>
+      </w:r>
+      <w:r>
+        <w:t xml:space="preserve"> </w:t>
+      </w:r>
+      <w:r>
+        <w:t>파인튜닝의</w:t>
+      </w:r>
+      <w:r>
+        <w:t xml:space="preserve"> </w:t>
+      </w:r>
+      <w:r>
+        <w:t>혼합</w:t>
+      </w:r>
+      <w:r>
+        <w:t xml:space="preserve"> </w:t>
+      </w:r>
+      <w:r>
+        <w:t>결과를</w:t>
+      </w:r>
+      <w:r>
+        <w:t xml:space="preserve"> </w:t>
+      </w:r>
+      <w:r>
+        <w:t>바탕으로</w:t>
+      </w:r>
+      <w:r>
+        <w:t xml:space="preserve"> </w:t>
+      </w:r>
+      <w:r>
+        <w:t>주석과</w:t>
+      </w:r>
+      <w:r>
+        <w:t xml:space="preserve"> </w:t>
+      </w:r>
+      <w:r>
+        <w:t>평가</w:t>
+      </w:r>
+      <w:r>
+        <w:t xml:space="preserve"> </w:t>
+      </w:r>
+      <w:r>
+        <w:t>장면을</w:t>
+      </w:r>
+      <w:r>
+        <w:t xml:space="preserve"> </w:t>
+      </w:r>
+      <w:r>
+        <w:t>보강하고</w:t>
+      </w:r>
+      <w:r>
+        <w:t xml:space="preserve">, </w:t>
       </w:r>
       <w:r>
         <w:t>시간</w:t>
@@ -11762,7 +13060,13 @@
         <w:t xml:space="preserve"> </w:t>
       </w:r>
       <w:r>
-        <w:t>해석이다</w:t>
+        <w:t>해석을</w:t>
+      </w:r>
+      <w:r>
+        <w:t xml:space="preserve"> </w:t>
+      </w:r>
+      <w:r>
+        <w:t>확장한다</w:t>
       </w:r>
       <w:r>
         <w:t>.</w:t>
@@ -14747,7 +16051,6 @@
         <w:pageBreakBefore/>
       </w:pPr>
       <w:r>
-        <w:lastRenderedPageBreak/>
         <w:t xml:space="preserve">8 </w:t>
       </w:r>
       <w:r>
@@ -15897,10 +17200,10 @@
           <w:noProof/>
         </w:rPr>
         <w:drawing>
-          <wp:inline distT="0" distB="0" distL="0" distR="0" wp14:anchorId="24B96FC1" wp14:editId="79011188">
+          <wp:inline distT="0" distB="0" distL="0" distR="0" wp14:anchorId="14CF6CE9" wp14:editId="7491E881">
             <wp:extent cx="6400800" cy="3600450"/>
             <wp:effectExtent l="0" t="0" r="0" b="0"/>
-            <wp:docPr id="3" name="Picture 3"/>
+            <wp:docPr id="4" name="Picture 4"/>
             <wp:cNvGraphicFramePr>
               <a:graphicFrameLocks xmlns:a="http://schemas.openxmlformats.org/drawingml/2006/main" noChangeAspect="1"/>
             </wp:cNvGraphicFramePr>
@@ -15912,7 +17215,7 @@
                     <pic:cNvPicPr/>
                   </pic:nvPicPr>
                   <pic:blipFill>
-                    <a:blip r:embed="rId14"/>
+                    <a:blip r:embed="rId16"/>
                     <a:stretch>
                       <a:fillRect/>
                     </a:stretch>
@@ -16081,7 +17384,7 @@
       <w:r>
         <w:t xml:space="preserve"> </w:t>
       </w:r>
-      <w:hyperlink r:id="rId15">
+      <w:hyperlink r:id="rId17">
         <w:r>
           <w:rPr>
             <w:color w:val="245C7A"/>
@@ -16354,104 +17657,7 @@
           <w:noProof/>
         </w:rPr>
         <w:drawing>
-          <wp:inline distT="0" distB="0" distL="0" distR="0" wp14:anchorId="390A871E" wp14:editId="63EE5559">
-            <wp:extent cx="6400800" cy="6134100"/>
-            <wp:effectExtent l="0" t="0" r="0" b="0"/>
-            <wp:docPr id="4" name="Picture 4"/>
-            <wp:cNvGraphicFramePr>
-              <a:graphicFrameLocks xmlns:a="http://schemas.openxmlformats.org/drawingml/2006/main" noChangeAspect="1"/>
-            </wp:cNvGraphicFramePr>
-            <a:graphic xmlns:a="http://schemas.openxmlformats.org/drawingml/2006/main">
-              <a:graphicData uri="http://schemas.openxmlformats.org/drawingml/2006/picture">
-                <pic:pic xmlns:pic="http://schemas.openxmlformats.org/drawingml/2006/picture">
-                  <pic:nvPicPr>
-                    <pic:cNvPr id="0" name="clip-03-000400-report.png"/>
-                    <pic:cNvPicPr/>
-                  </pic:nvPicPr>
-                  <pic:blipFill>
-                    <a:blip r:embed="rId16"/>
-                    <a:stretch>
-                      <a:fillRect/>
-                    </a:stretch>
-                  </pic:blipFill>
-                  <pic:spPr>
-                    <a:xfrm>
-                      <a:off x="0" y="0"/>
-                      <a:ext cx="6400800" cy="6134100"/>
-                    </a:xfrm>
-                    <a:prstGeom prst="rect">
-                      <a:avLst/>
-                    </a:prstGeom>
-                  </pic:spPr>
-                </pic:pic>
-              </a:graphicData>
-            </a:graphic>
-          </wp:inline>
-        </w:drawing>
-      </w:r>
-    </w:p>
-    <w:p>
-      <w:pPr>
-        <w:pStyle w:val="af0"/>
-        <w:spacing w:after="200"/>
-      </w:pPr>
-      <w:r>
-        <w:t>작은</w:t>
-      </w:r>
-      <w:r>
-        <w:t xml:space="preserve"> </w:t>
-      </w:r>
-      <w:r>
-        <w:t>네온</w:t>
-      </w:r>
-      <w:r>
-        <w:t>·</w:t>
-      </w:r>
-      <w:r>
-        <w:t>간판과</w:t>
-      </w:r>
-      <w:r>
-        <w:t xml:space="preserve"> </w:t>
-      </w:r>
-      <w:r>
-        <w:t>오른쪽</w:t>
-      </w:r>
-      <w:r>
-        <w:t xml:space="preserve"> </w:t>
-      </w:r>
-      <w:r>
-        <w:t>건물의</w:t>
-      </w:r>
-      <w:r>
-        <w:t xml:space="preserve"> </w:t>
-      </w:r>
-      <w:r>
-        <w:t>밝은</w:t>
-      </w:r>
-      <w:r>
-        <w:t xml:space="preserve"> </w:t>
-      </w:r>
-      <w:r>
-        <w:t>면</w:t>
-      </w:r>
-      <w:r>
-        <w:t xml:space="preserve"> </w:t>
-      </w:r>
-      <w:r>
-        <w:t>복구</w:t>
-      </w:r>
-    </w:p>
-    <w:p>
-      <w:pPr>
-        <w:keepNext/>
-        <w:spacing w:after="40" w:line="240" w:lineRule="auto"/>
-      </w:pPr>
-      <w:r>
-        <w:rPr>
-          <w:noProof/>
-        </w:rPr>
-        <w:drawing>
-          <wp:inline distT="0" distB="0" distL="0" distR="0" wp14:anchorId="494D342A" wp14:editId="31D6FA43">
+          <wp:inline distT="0" distB="0" distL="0" distR="0" wp14:anchorId="1C91901B" wp14:editId="17521D60">
             <wp:extent cx="6400800" cy="6134100"/>
             <wp:effectExtent l="0" t="0" r="0" b="0"/>
             <wp:docPr id="5" name="Picture 5"/>
@@ -16462,98 +17668,7 @@
               <a:graphicData uri="http://schemas.openxmlformats.org/drawingml/2006/picture">
                 <pic:pic xmlns:pic="http://schemas.openxmlformats.org/drawingml/2006/picture">
                   <pic:nvPicPr>
-                    <pic:cNvPr id="0" name="clip-03-000500-report.png"/>
-                    <pic:cNvPicPr/>
-                  </pic:nvPicPr>
-                  <pic:blipFill>
-                    <a:blip r:embed="rId17"/>
-                    <a:stretch>
-                      <a:fillRect/>
-                    </a:stretch>
-                  </pic:blipFill>
-                  <pic:spPr>
-                    <a:xfrm>
-                      <a:off x="0" y="0"/>
-                      <a:ext cx="6400800" cy="6134100"/>
-                    </a:xfrm>
-                    <a:prstGeom prst="rect">
-                      <a:avLst/>
-                    </a:prstGeom>
-                  </pic:spPr>
-                </pic:pic>
-              </a:graphicData>
-            </a:graphic>
-          </wp:inline>
-        </w:drawing>
-      </w:r>
-    </w:p>
-    <w:p>
-      <w:pPr>
-        <w:pStyle w:val="af0"/>
-        <w:spacing w:after="200"/>
-      </w:pPr>
-      <w:r>
-        <w:t>따뜻한</w:t>
-      </w:r>
-      <w:r>
-        <w:t xml:space="preserve"> </w:t>
-      </w:r>
-      <w:r>
-        <w:t>상가</w:t>
-      </w:r>
-      <w:r>
-        <w:t xml:space="preserve"> </w:t>
-      </w:r>
-      <w:r>
-        <w:t>조명과</w:t>
-      </w:r>
-      <w:r>
-        <w:t xml:space="preserve"> </w:t>
-      </w:r>
-      <w:r>
-        <w:t>넓은</w:t>
-      </w:r>
-      <w:r>
-        <w:t xml:space="preserve"> </w:t>
-      </w:r>
-      <w:r>
-        <w:t>밝은</w:t>
-      </w:r>
-      <w:r>
-        <w:t xml:space="preserve"> </w:t>
-      </w:r>
-      <w:r>
-        <w:t>면의</w:t>
-      </w:r>
-      <w:r>
-        <w:t xml:space="preserve"> </w:t>
-      </w:r>
-      <w:r>
-        <w:t>기여</w:t>
-      </w:r>
-    </w:p>
-    <w:p>
-      <w:pPr>
-        <w:keepNext/>
-        <w:spacing w:after="40" w:line="240" w:lineRule="auto"/>
-      </w:pPr>
-      <w:r>
-        <w:rPr>
-          <w:noProof/>
-        </w:rPr>
-        <w:drawing>
-          <wp:inline distT="0" distB="0" distL="0" distR="0" wp14:anchorId="1F4BAF5D" wp14:editId="35934027">
-            <wp:extent cx="6400800" cy="6134100"/>
-            <wp:effectExtent l="0" t="0" r="0" b="0"/>
-            <wp:docPr id="6" name="Picture 6"/>
-            <wp:cNvGraphicFramePr>
-              <a:graphicFrameLocks xmlns:a="http://schemas.openxmlformats.org/drawingml/2006/main" noChangeAspect="1"/>
-            </wp:cNvGraphicFramePr>
-            <a:graphic xmlns:a="http://schemas.openxmlformats.org/drawingml/2006/main">
-              <a:graphicData uri="http://schemas.openxmlformats.org/drawingml/2006/picture">
-                <pic:pic xmlns:pic="http://schemas.openxmlformats.org/drawingml/2006/picture">
-                  <pic:nvPicPr>
-                    <pic:cNvPr id="0" name="clip-03-000600-report.png"/>
+                    <pic:cNvPr id="0" name="clip-03-000400-report.png"/>
                     <pic:cNvPicPr/>
                   </pic:nvPicPr>
                   <pic:blipFill>
@@ -16584,37 +17699,49 @@
         <w:spacing w:after="200"/>
       </w:pPr>
       <w:r>
-        <w:t>사람</w:t>
-      </w:r>
-      <w:r>
-        <w:t xml:space="preserve"> </w:t>
-      </w:r>
-      <w:r>
-        <w:t>검출과</w:t>
-      </w:r>
-      <w:r>
-        <w:t xml:space="preserve"> </w:t>
-      </w:r>
-      <w:r>
-        <w:t>주변</w:t>
-      </w:r>
-      <w:r>
-        <w:t xml:space="preserve"> </w:t>
-      </w:r>
-      <w:r>
-        <w:t>조명의</w:t>
-      </w:r>
-      <w:r>
-        <w:t xml:space="preserve"> </w:t>
-      </w:r>
-      <w:r>
-        <w:t>독립적인</w:t>
-      </w:r>
-      <w:r>
-        <w:t xml:space="preserve"> </w:t>
-      </w:r>
-      <w:r>
-        <w:t>기여</w:t>
+        <w:t>작은</w:t>
+      </w:r>
+      <w:r>
+        <w:t xml:space="preserve"> </w:t>
+      </w:r>
+      <w:r>
+        <w:t>네온</w:t>
+      </w:r>
+      <w:r>
+        <w:t>·</w:t>
+      </w:r>
+      <w:r>
+        <w:t>간판과</w:t>
+      </w:r>
+      <w:r>
+        <w:t xml:space="preserve"> </w:t>
+      </w:r>
+      <w:r>
+        <w:t>오른쪽</w:t>
+      </w:r>
+      <w:r>
+        <w:t xml:space="preserve"> </w:t>
+      </w:r>
+      <w:r>
+        <w:t>건물의</w:t>
+      </w:r>
+      <w:r>
+        <w:t xml:space="preserve"> </w:t>
+      </w:r>
+      <w:r>
+        <w:t>밝은</w:t>
+      </w:r>
+      <w:r>
+        <w:t xml:space="preserve"> </w:t>
+      </w:r>
+      <w:r>
+        <w:t>면</w:t>
+      </w:r>
+      <w:r>
+        <w:t xml:space="preserve"> </w:t>
+      </w:r>
+      <w:r>
+        <w:t>복구</w:t>
       </w:r>
     </w:p>
     <w:p>
@@ -16627,10 +17754,186 @@
           <w:noProof/>
         </w:rPr>
         <w:drawing>
-          <wp:inline distT="0" distB="0" distL="0" distR="0" wp14:anchorId="6D10E8F0" wp14:editId="3CC5380C">
+          <wp:inline distT="0" distB="0" distL="0" distR="0" wp14:anchorId="443D9CE1" wp14:editId="0AB835A3">
+            <wp:extent cx="6400800" cy="6134100"/>
+            <wp:effectExtent l="0" t="0" r="0" b="0"/>
+            <wp:docPr id="6" name="Picture 6"/>
+            <wp:cNvGraphicFramePr>
+              <a:graphicFrameLocks xmlns:a="http://schemas.openxmlformats.org/drawingml/2006/main" noChangeAspect="1"/>
+            </wp:cNvGraphicFramePr>
+            <a:graphic xmlns:a="http://schemas.openxmlformats.org/drawingml/2006/main">
+              <a:graphicData uri="http://schemas.openxmlformats.org/drawingml/2006/picture">
+                <pic:pic xmlns:pic="http://schemas.openxmlformats.org/drawingml/2006/picture">
+                  <pic:nvPicPr>
+                    <pic:cNvPr id="0" name="clip-03-000500-report.png"/>
+                    <pic:cNvPicPr/>
+                  </pic:nvPicPr>
+                  <pic:blipFill>
+                    <a:blip r:embed="rId19"/>
+                    <a:stretch>
+                      <a:fillRect/>
+                    </a:stretch>
+                  </pic:blipFill>
+                  <pic:spPr>
+                    <a:xfrm>
+                      <a:off x="0" y="0"/>
+                      <a:ext cx="6400800" cy="6134100"/>
+                    </a:xfrm>
+                    <a:prstGeom prst="rect">
+                      <a:avLst/>
+                    </a:prstGeom>
+                  </pic:spPr>
+                </pic:pic>
+              </a:graphicData>
+            </a:graphic>
+          </wp:inline>
+        </w:drawing>
+      </w:r>
+    </w:p>
+    <w:p>
+      <w:pPr>
+        <w:pStyle w:val="af0"/>
+        <w:spacing w:after="200"/>
+      </w:pPr>
+      <w:r>
+        <w:t>따뜻한</w:t>
+      </w:r>
+      <w:r>
+        <w:t xml:space="preserve"> </w:t>
+      </w:r>
+      <w:r>
+        <w:t>상가</w:t>
+      </w:r>
+      <w:r>
+        <w:t xml:space="preserve"> </w:t>
+      </w:r>
+      <w:r>
+        <w:t>조명과</w:t>
+      </w:r>
+      <w:r>
+        <w:t xml:space="preserve"> </w:t>
+      </w:r>
+      <w:r>
+        <w:t>넓은</w:t>
+      </w:r>
+      <w:r>
+        <w:t xml:space="preserve"> </w:t>
+      </w:r>
+      <w:r>
+        <w:t>밝은</w:t>
+      </w:r>
+      <w:r>
+        <w:t xml:space="preserve"> </w:t>
+      </w:r>
+      <w:r>
+        <w:t>면의</w:t>
+      </w:r>
+      <w:r>
+        <w:t xml:space="preserve"> </w:t>
+      </w:r>
+      <w:r>
+        <w:t>기여</w:t>
+      </w:r>
+    </w:p>
+    <w:p>
+      <w:pPr>
+        <w:keepNext/>
+        <w:spacing w:after="40" w:line="240" w:lineRule="auto"/>
+      </w:pPr>
+      <w:r>
+        <w:rPr>
+          <w:noProof/>
+        </w:rPr>
+        <w:drawing>
+          <wp:inline distT="0" distB="0" distL="0" distR="0" wp14:anchorId="57EE7625" wp14:editId="723751AA">
+            <wp:extent cx="6400800" cy="6134100"/>
+            <wp:effectExtent l="0" t="0" r="0" b="0"/>
+            <wp:docPr id="7" name="Picture 7"/>
+            <wp:cNvGraphicFramePr>
+              <a:graphicFrameLocks xmlns:a="http://schemas.openxmlformats.org/drawingml/2006/main" noChangeAspect="1"/>
+            </wp:cNvGraphicFramePr>
+            <a:graphic xmlns:a="http://schemas.openxmlformats.org/drawingml/2006/main">
+              <a:graphicData uri="http://schemas.openxmlformats.org/drawingml/2006/picture">
+                <pic:pic xmlns:pic="http://schemas.openxmlformats.org/drawingml/2006/picture">
+                  <pic:nvPicPr>
+                    <pic:cNvPr id="0" name="clip-03-000600-report.png"/>
+                    <pic:cNvPicPr/>
+                  </pic:nvPicPr>
+                  <pic:blipFill>
+                    <a:blip r:embed="rId20"/>
+                    <a:stretch>
+                      <a:fillRect/>
+                    </a:stretch>
+                  </pic:blipFill>
+                  <pic:spPr>
+                    <a:xfrm>
+                      <a:off x="0" y="0"/>
+                      <a:ext cx="6400800" cy="6134100"/>
+                    </a:xfrm>
+                    <a:prstGeom prst="rect">
+                      <a:avLst/>
+                    </a:prstGeom>
+                  </pic:spPr>
+                </pic:pic>
+              </a:graphicData>
+            </a:graphic>
+          </wp:inline>
+        </w:drawing>
+      </w:r>
+    </w:p>
+    <w:p>
+      <w:pPr>
+        <w:pStyle w:val="af0"/>
+        <w:spacing w:after="200"/>
+      </w:pPr>
+      <w:r>
+        <w:t>사람</w:t>
+      </w:r>
+      <w:r>
+        <w:t xml:space="preserve"> </w:t>
+      </w:r>
+      <w:r>
+        <w:t>검출과</w:t>
+      </w:r>
+      <w:r>
+        <w:t xml:space="preserve"> </w:t>
+      </w:r>
+      <w:r>
+        <w:t>주변</w:t>
+      </w:r>
+      <w:r>
+        <w:t xml:space="preserve"> </w:t>
+      </w:r>
+      <w:r>
+        <w:t>조명의</w:t>
+      </w:r>
+      <w:r>
+        <w:t xml:space="preserve"> </w:t>
+      </w:r>
+      <w:r>
+        <w:t>독립적인</w:t>
+      </w:r>
+      <w:r>
+        <w:t xml:space="preserve"> </w:t>
+      </w:r>
+      <w:r>
+        <w:t>기여</w:t>
+      </w:r>
+    </w:p>
+    <w:p>
+      <w:pPr>
+        <w:keepNext/>
+        <w:spacing w:after="40" w:line="240" w:lineRule="auto"/>
+      </w:pPr>
+      <w:r>
+        <w:rPr>
+          <w:noProof/>
+        </w:rPr>
+        <w:drawing>
+          <wp:inline distT="0" distB="0" distL="0" distR="0" wp14:anchorId="4F44D9FF" wp14:editId="1F6BF391">
             <wp:extent cx="6400800" cy="3920490"/>
             <wp:effectExtent l="0" t="0" r="0" b="0"/>
-            <wp:docPr id="7" name="Picture 7"/>
+            <wp:docPr id="8" name="Picture 8"/>
             <wp:cNvGraphicFramePr>
               <a:graphicFrameLocks xmlns:a="http://schemas.openxmlformats.org/drawingml/2006/main" noChangeAspect="1"/>
             </wp:cNvGraphicFramePr>
@@ -16642,7 +17945,7 @@
                     <pic:cNvPicPr/>
                   </pic:nvPicPr>
                   <pic:blipFill>
-                    <a:blip r:embed="rId19"/>
+                    <a:blip r:embed="rId21"/>
                     <a:stretch>
                       <a:fillRect/>
                     </a:stretch>
@@ -16784,7 +18087,7 @@
       <w:r>
         <w:t xml:space="preserve">. </w:t>
       </w:r>
-      <w:hyperlink r:id="rId20">
+      <w:hyperlink r:id="rId22">
         <w:r>
           <w:rPr>
             <w:color w:val="245C7A"/>
@@ -17177,10 +18480,10 @@
           <w:noProof/>
         </w:rPr>
         <w:drawing>
-          <wp:inline distT="0" distB="0" distL="0" distR="0" wp14:anchorId="7503FDBF" wp14:editId="352A7CFA">
+          <wp:inline distT="0" distB="0" distL="0" distR="0" wp14:anchorId="0B6BB2AF" wp14:editId="3DB28F1C">
             <wp:extent cx="6400800" cy="2560320"/>
             <wp:effectExtent l="0" t="0" r="0" b="0"/>
-            <wp:docPr id="8" name="Picture 8"/>
+            <wp:docPr id="9" name="Picture 9"/>
             <wp:cNvGraphicFramePr>
               <a:graphicFrameLocks xmlns:a="http://schemas.openxmlformats.org/drawingml/2006/main" noChangeAspect="1"/>
             </wp:cNvGraphicFramePr>
@@ -17192,7 +18495,7 @@
                     <pic:cNvPicPr/>
                   </pic:nvPicPr>
                   <pic:blipFill>
-                    <a:blip r:embed="rId21"/>
+                    <a:blip r:embed="rId23"/>
                     <a:stretch>
                       <a:fillRect/>
                     </a:stretch>
@@ -17442,7 +18745,7 @@
       <w:r>
         <w:t xml:space="preserve"> </w:t>
       </w:r>
-      <w:hyperlink r:id="rId22">
+      <w:hyperlink r:id="rId24">
         <w:r>
           <w:rPr>
             <w:color w:val="245C7A"/>
@@ -17761,7 +19064,7 @@
       <w:r>
         <w:t xml:space="preserve">. </w:t>
       </w:r>
-      <w:hyperlink r:id="rId23">
+      <w:hyperlink r:id="rId25">
         <w:r>
           <w:rPr>
             <w:color w:val="245C7A"/>
@@ -19480,7 +20783,7 @@
       <w:r>
         <w:t xml:space="preserve">1. </w:t>
       </w:r>
-      <w:hyperlink r:id="rId24">
+      <w:hyperlink r:id="rId26">
         <w:r>
           <w:rPr>
             <w:color w:val="245C7A"/>
@@ -19529,7 +20832,7 @@
       <w:r>
         <w:t xml:space="preserve">2. </w:t>
       </w:r>
-      <w:hyperlink r:id="rId25">
+      <w:hyperlink r:id="rId27">
         <w:r>
           <w:rPr>
             <w:color w:val="245C7A"/>
@@ -19590,7 +20893,7 @@
       <w:r>
         <w:t xml:space="preserve">3. </w:t>
       </w:r>
-      <w:hyperlink r:id="rId26">
+      <w:hyperlink r:id="rId28">
         <w:r>
           <w:rPr>
             <w:color w:val="245C7A"/>
@@ -19613,7 +20916,7 @@
       <w:r>
         <w:t xml:space="preserve"> </w:t>
       </w:r>
-      <w:hyperlink r:id="rId27">
+      <w:hyperlink r:id="rId29">
         <w:r>
           <w:rPr>
             <w:color w:val="245C7A"/>
@@ -19662,7 +20965,7 @@
       <w:r>
         <w:t xml:space="preserve">4. </w:t>
       </w:r>
-      <w:hyperlink r:id="rId28">
+      <w:hyperlink r:id="rId30">
         <w:r>
           <w:rPr>
             <w:color w:val="245C7A"/>
@@ -19747,7 +21050,7 @@
       <w:r>
         <w:t xml:space="preserve">5. </w:t>
       </w:r>
-      <w:hyperlink r:id="rId29">
+      <w:hyperlink r:id="rId31">
         <w:r>
           <w:rPr>
             <w:color w:val="245C7A"/>
@@ -19802,7 +21105,7 @@
       <w:r>
         <w:t xml:space="preserve">6. </w:t>
       </w:r>
-      <w:hyperlink r:id="rId30">
+      <w:hyperlink r:id="rId32">
         <w:r>
           <w:rPr>
             <w:color w:val="245C7A"/>
@@ -19863,7 +21166,7 @@
       <w:r>
         <w:t xml:space="preserve">7. </w:t>
       </w:r>
-      <w:hyperlink r:id="rId31">
+      <w:hyperlink r:id="rId33">
         <w:r>
           <w:rPr>
             <w:color w:val="245C7A"/>
@@ -19942,7 +21245,7 @@
       <w:r>
         <w:t xml:space="preserve">8. </w:t>
       </w:r>
-      <w:hyperlink r:id="rId32">
+      <w:hyperlink r:id="rId34">
         <w:r>
           <w:rPr>
             <w:color w:val="245C7A"/>
@@ -20009,7 +21312,7 @@
       <w:r>
         <w:t xml:space="preserve">9. </w:t>
       </w:r>
-      <w:hyperlink r:id="rId33">
+      <w:hyperlink r:id="rId35">
         <w:r>
           <w:rPr>
             <w:color w:val="245C7A"/>
@@ -20020,7 +21323,7 @@
           <w:rPr>
             <w:color w:val="245C7A"/>
           </w:rPr>
-          <w:t>공식</w:t>
+          <w:t>개발</w:t>
         </w:r>
         <w:r>
           <w:rPr>
@@ -20032,80 +21335,26 @@
           <w:rPr>
             <w:color w:val="245C7A"/>
           </w:rPr>
-          <w:t>내비게이션</w:t>
-        </w:r>
-        <w:r>
-          <w:rPr>
-            <w:color w:val="245C7A"/>
-          </w:rPr>
-          <w:t xml:space="preserve"> </w:t>
-        </w:r>
-        <w:r>
-          <w:rPr>
-            <w:color w:val="245C7A"/>
-          </w:rPr>
-          <w:t>샘플</w:t>
+          <w:t>환경</w:t>
         </w:r>
       </w:hyperlink>
       <w:r>
-        <w:t xml:space="preserve"> — </w:t>
-      </w:r>
-      <w:r>
-        <w:t>연동</w:t>
-      </w:r>
-      <w:r>
-        <w:t xml:space="preserve"> </w:t>
-      </w:r>
-      <w:r>
-        <w:t>구조</w:t>
-      </w:r>
-      <w:r>
-        <w:t xml:space="preserve"> </w:t>
-      </w:r>
-      <w:r>
-        <w:t>참고</w:t>
-      </w:r>
-      <w:r>
-        <w:t xml:space="preserve">. </w:t>
-      </w:r>
-      <w:r>
-        <w:t>코드</w:t>
-      </w:r>
-      <w:r>
-        <w:t xml:space="preserve"> </w:t>
-      </w:r>
-      <w:r>
-        <w:t>도입</w:t>
-      </w:r>
-      <w:r>
-        <w:t xml:space="preserve"> </w:t>
-      </w:r>
-      <w:r>
-        <w:t>전</w:t>
-      </w:r>
-      <w:r>
-        <w:t xml:space="preserve"> </w:t>
-      </w:r>
-      <w:r>
-        <w:t>라이선스</w:t>
-      </w:r>
-      <w:r>
-        <w:t xml:space="preserve"> </w:t>
-      </w:r>
-      <w:r>
-        <w:t>범위</w:t>
-      </w:r>
-      <w:r>
-        <w:t xml:space="preserve"> </w:t>
-      </w:r>
-      <w:r>
-        <w:t>확인</w:t>
-      </w:r>
-      <w:r>
-        <w:t xml:space="preserve"> </w:t>
-      </w:r>
-      <w:r>
-        <w:t>필요</w:t>
+        <w:t xml:space="preserve"> — minSdk 28 </w:t>
+      </w:r>
+      <w:r>
+        <w:t>이상과</w:t>
+      </w:r>
+      <w:r>
+        <w:t xml:space="preserve"> API 34 </w:t>
+      </w:r>
+      <w:r>
+        <w:t>에뮬레이터</w:t>
+      </w:r>
+      <w:r>
+        <w:t xml:space="preserve"> </w:t>
+      </w:r>
+      <w:r>
+        <w:t>구성</w:t>
       </w:r>
       <w:r>
         <w:t>.</w:t>
@@ -20118,7 +21367,7 @@
       <w:r>
         <w:t xml:space="preserve">10. </w:t>
       </w:r>
-      <w:hyperlink r:id="rId34">
+      <w:hyperlink r:id="rId36">
         <w:r>
           <w:rPr>
             <w:color w:val="245C7A"/>
@@ -20197,7 +21446,7 @@
       <w:r>
         <w:t xml:space="preserve">11. </w:t>
       </w:r>
-      <w:hyperlink r:id="rId35">
+      <w:hyperlink r:id="rId37">
         <w:r>
           <w:rPr>
             <w:color w:val="245C7A"/>
@@ -20318,8 +21567,8 @@
       </w:r>
     </w:p>
     <w:sectPr>
-      <w:headerReference w:type="default" r:id="rId36"/>
-      <w:footerReference w:type="default" r:id="rId37"/>
+      <w:headerReference w:type="default" r:id="rId38"/>
+      <w:footerReference w:type="default" r:id="rId39"/>
       <w:pgSz w:w="12240" w:h="15840"/>
       <w:pgMar w:top="979" w:right="1080" w:bottom="936" w:left="1080" w:header="432" w:footer="432" w:gutter="0"/>
       <w:cols w:space="720"/>
@@ -20602,31 +21851,31 @@
       </w:rPr>
     </w:lvl>
   </w:abstractNum>
-  <w:num w:numId="1" w16cid:durableId="1075786373">
+  <w:num w:numId="1" w16cid:durableId="1479374707">
     <w:abstractNumId w:val="8"/>
   </w:num>
-  <w:num w:numId="2" w16cid:durableId="1446000345">
+  <w:num w:numId="2" w16cid:durableId="377052256">
     <w:abstractNumId w:val="6"/>
   </w:num>
-  <w:num w:numId="3" w16cid:durableId="37439330">
+  <w:num w:numId="3" w16cid:durableId="450049608">
     <w:abstractNumId w:val="5"/>
   </w:num>
-  <w:num w:numId="4" w16cid:durableId="1026097174">
+  <w:num w:numId="4" w16cid:durableId="455753182">
     <w:abstractNumId w:val="4"/>
   </w:num>
-  <w:num w:numId="5" w16cid:durableId="1944923819">
+  <w:num w:numId="5" w16cid:durableId="545725023">
     <w:abstractNumId w:val="7"/>
   </w:num>
-  <w:num w:numId="6" w16cid:durableId="7829192">
+  <w:num w:numId="6" w16cid:durableId="1439132672">
     <w:abstractNumId w:val="3"/>
   </w:num>
-  <w:num w:numId="7" w16cid:durableId="1827933836">
+  <w:num w:numId="7" w16cid:durableId="1849173469">
     <w:abstractNumId w:val="2"/>
   </w:num>
-  <w:num w:numId="8" w16cid:durableId="1429235035">
+  <w:num w:numId="8" w16cid:durableId="363866981">
     <w:abstractNumId w:val="1"/>
   </w:num>
-  <w:num w:numId="9" w16cid:durableId="1155606367">
+  <w:num w:numId="9" w16cid:durableId="1216502074">
     <w:abstractNumId w:val="0"/>
   </w:num>
 </w:numbering>

</xml_diff>

<commit_message>
Describe scene data without dataset counts in public summaries
</commit_message>
<xml_diff>
--- a/docs/product/DrivingMood-Design.docx
+++ b/docs/product/DrivingMood-Design.docx
@@ -1864,7 +1864,7 @@
           <w:noProof/>
         </w:rPr>
         <w:drawing>
-          <wp:inline distT="0" distB="0" distL="0" distR="0" wp14:anchorId="58050FB1" wp14:editId="5537E220">
+          <wp:inline distT="0" distB="0" distL="0" distR="0" wp14:anchorId="467AF421" wp14:editId="75F47E36">
             <wp:extent cx="6400800" cy="3120390"/>
             <wp:effectExtent l="0" t="0" r="0" b="0"/>
             <wp:docPr id="1" name="Picture 1"/>
@@ -3843,7 +3843,7 @@
           <w:noProof/>
         </w:rPr>
         <w:drawing>
-          <wp:inline distT="0" distB="0" distL="0" distR="0" wp14:anchorId="5BEAC3E2" wp14:editId="5869A245">
+          <wp:inline distT="0" distB="0" distL="0" distR="0" wp14:anchorId="3F9AD0DB" wp14:editId="314B497C">
             <wp:extent cx="6400800" cy="2221454"/>
             <wp:effectExtent l="0" t="0" r="0" b="0"/>
             <wp:docPr id="2" name="Picture 2"/>
@@ -6878,16 +6878,22 @@
         <w:t xml:space="preserve"> </w:t>
       </w:r>
       <w:r>
+        <w:t>차량</w:t>
+      </w:r>
+      <w:r>
+        <w:t xml:space="preserve"> </w:t>
+      </w:r>
+      <w:r>
         <w:t>주행</w:t>
       </w:r>
       <w:r>
-        <w:t xml:space="preserve"> 6</w:t>
-      </w:r>
-      <w:r>
-        <w:t>개</w:t>
-      </w:r>
-      <w:r>
-        <w:t>·4,757</w:t>
+        <w:t xml:space="preserve"> </w:t>
+      </w:r>
+      <w:r>
+        <w:t>영상의</w:t>
+      </w:r>
+      <w:r>
+        <w:t xml:space="preserve"> </w:t>
       </w:r>
       <w:r>
         <w:t>프레임에서</w:t>
@@ -7661,34 +7667,22 @@
         <w:t>학습</w:t>
       </w:r>
       <w:r>
-        <w:t xml:space="preserve"> 12</w:t>
-      </w:r>
-      <w:r>
-        <w:t>장</w:t>
-      </w:r>
-      <w:r>
         <w:t>·</w:t>
       </w:r>
       <w:r>
         <w:t>검증</w:t>
       </w:r>
       <w:r>
-        <w:t xml:space="preserve"> 4</w:t>
-      </w:r>
-      <w:r>
-        <w:t>장</w:t>
-      </w:r>
-      <w:r>
         <w:t>·</w:t>
       </w:r>
       <w:r>
         <w:t>시험</w:t>
       </w:r>
       <w:r>
-        <w:t xml:space="preserve"> 8</w:t>
-      </w:r>
-      <w:r>
-        <w:t>장을</w:t>
+        <w:t xml:space="preserve"> </w:t>
+      </w:r>
+      <w:r>
+        <w:t>자료를</w:t>
       </w:r>
       <w:r>
         <w:t xml:space="preserve"> </w:t>
@@ -7956,7 +7950,7 @@
           <w:noProof/>
         </w:rPr>
         <w:drawing>
-          <wp:inline distT="0" distB="0" distL="0" distR="0" wp14:anchorId="678323DB" wp14:editId="2D036CE4">
+          <wp:inline distT="0" distB="0" distL="0" distR="0" wp14:anchorId="304EF16A" wp14:editId="5F904167">
             <wp:extent cx="6400800" cy="2314135"/>
             <wp:effectExtent l="0" t="0" r="0" b="0"/>
             <wp:docPr id="3" name="Picture 3"/>
@@ -8039,13 +8033,13 @@
     </w:p>
     <w:p>
       <w:r>
-        <w:t>별도</w:t>
-      </w:r>
-      <w:r>
-        <w:t xml:space="preserve"> </w:t>
-      </w:r>
-      <w:r>
-        <w:t>영상의</w:t>
+        <w:t>별도로</w:t>
+      </w:r>
+      <w:r>
+        <w:t xml:space="preserve"> </w:t>
+      </w:r>
+      <w:r>
+        <w:t>분리한</w:t>
       </w:r>
       <w:r>
         <w:t xml:space="preserve"> </w:t>
@@ -8054,25 +8048,91 @@
         <w:t>시험</w:t>
       </w:r>
       <w:r>
+        <w:t xml:space="preserve"> </w:t>
+      </w:r>
+      <w:r>
+        <w:t>영상에서는</w:t>
+      </w:r>
+      <w:r>
+        <w:t xml:space="preserve"> </w:t>
+      </w:r>
+      <w:r>
+        <w:t>도로</w:t>
+      </w:r>
+      <w:r>
+        <w:t xml:space="preserve"> IoU</w:t>
+      </w:r>
+      <w:r>
+        <w:t>가</w:t>
+      </w:r>
+      <w:r>
+        <w:t xml:space="preserve"> 70.47%→79.80%</w:t>
+      </w:r>
+      <w:r>
+        <w:t>로</w:t>
+      </w:r>
+      <w:r>
+        <w:t xml:space="preserve"> </w:t>
+      </w:r>
+      <w:r>
+        <w:t>높아졌지만</w:t>
+      </w:r>
+      <w:r>
+        <w:t xml:space="preserve"> </w:t>
+      </w:r>
+      <w:r>
+        <w:t>보도는</w:t>
+      </w:r>
+      <w:r>
+        <w:t xml:space="preserve"> 62.80%→39.51%</w:t>
+      </w:r>
+      <w:r>
+        <w:t>로</w:t>
+      </w:r>
+      <w:r>
+        <w:t xml:space="preserve"> </w:t>
+      </w:r>
+      <w:r>
+        <w:t>낮아졌다</w:t>
+      </w:r>
+      <w:r>
+        <w:t xml:space="preserve">. </w:t>
+      </w:r>
+      <w:r>
+        <w:t>정답이</w:t>
+      </w:r>
+      <w:r>
+        <w:t xml:space="preserve"> </w:t>
+      </w:r>
+      <w:r>
+        <w:t>있는</w:t>
+      </w:r>
+      <w:r>
         <w:t xml:space="preserve"> 8</w:t>
       </w:r>
       <w:r>
-        <w:t>장에서는</w:t>
-      </w:r>
-      <w:r>
-        <w:t xml:space="preserve"> </w:t>
-      </w:r>
-      <w:r>
-        <w:t>도로</w:t>
+        <w:t>개</w:t>
+      </w:r>
+      <w:r>
+        <w:t xml:space="preserve"> </w:t>
+      </w:r>
+      <w:r>
+        <w:t>클래스</w:t>
+      </w:r>
+      <w:r>
+        <w:t xml:space="preserve"> </w:t>
+      </w:r>
+      <w:r>
+        <w:t>평균</w:t>
       </w:r>
       <w:r>
         <w:t xml:space="preserve"> IoU</w:t>
       </w:r>
       <w:r>
-        <w:t>가</w:t>
-      </w:r>
-      <w:r>
-        <w:t xml:space="preserve"> 70.47%→79.80%</w:t>
+        <w:t>도</w:t>
+      </w:r>
+      <w:r>
+        <w:t xml:space="preserve"> 60.44%→58.76%</w:t>
       </w:r>
       <w:r>
         <w:t>로</w:t>
@@ -8081,108 +8141,42 @@
         <w:t xml:space="preserve"> </w:t>
       </w:r>
       <w:r>
-        <w:t>높아졌지만</w:t>
-      </w:r>
-      <w:r>
-        <w:t xml:space="preserve"> </w:t>
-      </w:r>
-      <w:r>
-        <w:t>보도는</w:t>
-      </w:r>
-      <w:r>
-        <w:t xml:space="preserve"> 62.80%→39.51%</w:t>
-      </w:r>
-      <w:r>
-        <w:t>로</w:t>
-      </w:r>
-      <w:r>
-        <w:t xml:space="preserve"> </w:t>
-      </w:r>
-      <w:r>
-        <w:t>낮아졌다</w:t>
+        <w:t>내려가</w:t>
+      </w:r>
+      <w:r>
+        <w:t xml:space="preserve"> </w:t>
+      </w:r>
+      <w:r>
+        <w:t>기본</w:t>
+      </w:r>
+      <w:r>
+        <w:t xml:space="preserve"> </w:t>
+      </w:r>
+      <w:r>
+        <w:t>모델은</w:t>
+      </w:r>
+      <w:r>
+        <w:t xml:space="preserve"> </w:t>
+      </w:r>
+      <w:r>
+        <w:t>공식</w:t>
+      </w:r>
+      <w:r>
+        <w:t xml:space="preserve"> </w:t>
+      </w:r>
+      <w:r>
+        <w:t>가중치를</w:t>
+      </w:r>
+      <w:r>
+        <w:t xml:space="preserve"> </w:t>
+      </w:r>
+      <w:r>
+        <w:t>유지했다</w:t>
       </w:r>
       <w:r>
         <w:t xml:space="preserve">. </w:t>
       </w:r>
       <w:r>
-        <w:t>정답이</w:t>
-      </w:r>
-      <w:r>
-        <w:t xml:space="preserve"> </w:t>
-      </w:r>
-      <w:r>
-        <w:t>있는</w:t>
-      </w:r>
-      <w:r>
-        <w:t xml:space="preserve"> 8</w:t>
-      </w:r>
-      <w:r>
-        <w:t>개</w:t>
-      </w:r>
-      <w:r>
-        <w:t xml:space="preserve"> </w:t>
-      </w:r>
-      <w:r>
-        <w:t>클래스</w:t>
-      </w:r>
-      <w:r>
-        <w:t xml:space="preserve"> </w:t>
-      </w:r>
-      <w:r>
-        <w:t>평균</w:t>
-      </w:r>
-      <w:r>
-        <w:t xml:space="preserve"> IoU</w:t>
-      </w:r>
-      <w:r>
-        <w:t>도</w:t>
-      </w:r>
-      <w:r>
-        <w:t xml:space="preserve"> 60.44%→58.76%</w:t>
-      </w:r>
-      <w:r>
-        <w:t>로</w:t>
-      </w:r>
-      <w:r>
-        <w:t xml:space="preserve"> </w:t>
-      </w:r>
-      <w:r>
-        <w:t>내려가</w:t>
-      </w:r>
-      <w:r>
-        <w:t xml:space="preserve"> </w:t>
-      </w:r>
-      <w:r>
-        <w:t>기본</w:t>
-      </w:r>
-      <w:r>
-        <w:t xml:space="preserve"> </w:t>
-      </w:r>
-      <w:r>
-        <w:t>모델은</w:t>
-      </w:r>
-      <w:r>
-        <w:t xml:space="preserve"> </w:t>
-      </w:r>
-      <w:r>
-        <w:t>공식</w:t>
-      </w:r>
-      <w:r>
-        <w:t xml:space="preserve"> </w:t>
-      </w:r>
-      <w:r>
-        <w:t>가중치를</w:t>
-      </w:r>
-      <w:r>
-        <w:t xml:space="preserve"> </w:t>
-      </w:r>
-      <w:r>
-        <w:t>유지했다</w:t>
-      </w:r>
-      <w:r>
-        <w:t xml:space="preserve">. </w:t>
-      </w:r>
-      <w:r>
         <w:t>부분</w:t>
       </w:r>
       <w:r>
@@ -8237,7 +8231,13 @@
         <w:t xml:space="preserve"> </w:t>
       </w:r>
       <w:r>
-        <w:t>새</w:t>
+        <w:t>차량</w:t>
+      </w:r>
+      <w:r>
+        <w:t xml:space="preserve"> </w:t>
+      </w:r>
+      <w:r>
+        <w:t>주행</w:t>
       </w:r>
       <w:r>
         <w:t xml:space="preserve"> </w:t>
@@ -8249,19 +8249,19 @@
         <w:t xml:space="preserve"> </w:t>
       </w:r>
       <w:r>
-        <w:t>웹</w:t>
-      </w:r>
-      <w:r>
-        <w:t xml:space="preserve"> </w:t>
-      </w:r>
-      <w:r>
-        <w:t>사진을</w:t>
-      </w:r>
-      <w:r>
-        <w:t xml:space="preserve"> </w:t>
-      </w:r>
-      <w:r>
-        <w:t>추가한</w:t>
+        <w:t>이미지</w:t>
+      </w:r>
+      <w:r>
+        <w:t xml:space="preserve"> </w:t>
+      </w:r>
+      <w:r>
+        <w:t>자료를</w:t>
+      </w:r>
+      <w:r>
+        <w:t xml:space="preserve"> </w:t>
+      </w:r>
+      <w:r>
+        <w:t>보강한</w:t>
       </w:r>
       <w:r>
         <w:t xml:space="preserve"> 2</w:t>
@@ -8410,15 +8410,69 @@
     </w:p>
     <w:p>
       <w:r>
+        <w:t>실제</w:t>
+      </w:r>
+      <w:r>
+        <w:t xml:space="preserve"> </w:t>
+      </w:r>
+      <w:r>
+        <w:t>차량</w:t>
+      </w:r>
+      <w:r>
+        <w:t xml:space="preserve"> </w:t>
+      </w:r>
+      <w:r>
+        <w:t>주행</w:t>
+      </w:r>
+      <w:r>
+        <w:t xml:space="preserve"> </w:t>
+      </w:r>
+      <w:r>
+        <w:t>영상과</w:t>
+      </w:r>
+      <w:r>
+        <w:t xml:space="preserve"> </w:t>
+      </w:r>
+      <w:r>
+        <w:t>이미지</w:t>
+      </w:r>
+      <w:r>
+        <w:t xml:space="preserve"> </w:t>
+      </w:r>
+      <w:r>
+        <w:t>자료들을</w:t>
+      </w:r>
+      <w:r>
+        <w:t xml:space="preserve"> </w:t>
+      </w:r>
+      <w:r>
+        <w:t>바탕으로</w:t>
+      </w:r>
+      <w:r>
+        <w:t xml:space="preserve"> </w:t>
+      </w:r>
+      <w:r>
+        <w:t>장면</w:t>
+      </w:r>
+      <w:r>
+        <w:t xml:space="preserve"> </w:t>
+      </w:r>
+      <w:r>
+        <w:t>다양성을</w:t>
+      </w:r>
+      <w:r>
+        <w:t xml:space="preserve"> </w:t>
+      </w:r>
+      <w:r>
+        <w:t>보강했다</w:t>
+      </w:r>
+      <w:r>
+        <w:t xml:space="preserve">. </w:t>
+      </w:r>
+      <w:r>
         <w:t>학습</w:t>
       </w:r>
       <w:r>
-        <w:t xml:space="preserve"> 24</w:t>
-      </w:r>
-      <w:r>
-        <w:t>장</w:t>
-      </w:r>
-      <w:r>
         <w:t>·</w:t>
       </w:r>
       <w:r>
@@ -8431,10 +8485,16 @@
         <w:t>검증</w:t>
       </w:r>
       <w:r>
-        <w:t xml:space="preserve"> 8</w:t>
-      </w:r>
-      <w:r>
-        <w:t>장에</w:t>
+        <w:t xml:space="preserve"> </w:t>
+      </w:r>
+      <w:r>
+        <w:t>자료를</w:t>
+      </w:r>
+      <w:r>
+        <w:t xml:space="preserve"> </w:t>
+      </w:r>
+      <w:r>
+        <w:t>분리하고</w:t>
       </w:r>
       <w:r>
         <w:t xml:space="preserve"> AI </w:t>
@@ -8458,13 +8518,7 @@
         <w:t xml:space="preserve"> </w:t>
       </w:r>
       <w:r>
-        <w:t>주석</w:t>
-      </w:r>
-      <w:r>
-        <w:t xml:space="preserve"> 135</w:t>
-      </w:r>
-      <w:r>
-        <w:t>개를</w:t>
+        <w:t>주석을</w:t>
       </w:r>
       <w:r>
         <w:t xml:space="preserve"> </w:t>
@@ -8600,7 +8654,7 @@
           <w:noProof/>
         </w:rPr>
         <w:drawing>
-          <wp:inline distT="0" distB="0" distL="0" distR="0" wp14:anchorId="7775229E" wp14:editId="63BE05A7">
+          <wp:inline distT="0" distB="0" distL="0" distR="0" wp14:anchorId="3C29FAB7" wp14:editId="31840058">
             <wp:extent cx="6400800" cy="4023360"/>
             <wp:effectExtent l="0" t="0" r="0" b="0"/>
             <wp:docPr id="4" name="Picture 4"/>
@@ -8731,10 +8785,10 @@
         <w:t>회귀</w:t>
       </w:r>
       <w:r>
-        <w:t xml:space="preserve"> 8</w:t>
-      </w:r>
-      <w:r>
-        <w:t>장의</w:t>
+        <w:t xml:space="preserve"> </w:t>
+      </w:r>
+      <w:r>
+        <w:t>자료의</w:t>
       </w:r>
       <w:r>
         <w:t xml:space="preserve"> </w:t>
@@ -15619,12 +15673,6 @@
         <w:t>기존</w:t>
       </w:r>
       <w:r>
-        <w:t xml:space="preserve"> 6</w:t>
-      </w:r>
-      <w:r>
-        <w:t>개</w:t>
-      </w:r>
-      <w:r>
         <w:t xml:space="preserve"> </w:t>
       </w:r>
       <w:r>
@@ -15652,13 +15700,19 @@
         <w:t xml:space="preserve"> </w:t>
       </w:r>
       <w:r>
-        <w:t>새</w:t>
-      </w:r>
-      <w:r>
-        <w:t xml:space="preserve"> 4</w:t>
-      </w:r>
-      <w:r>
-        <w:t>개</w:t>
+        <w:t>추가</w:t>
+      </w:r>
+      <w:r>
+        <w:t xml:space="preserve"> </w:t>
+      </w:r>
+      <w:r>
+        <w:t>차량</w:t>
+      </w:r>
+      <w:r>
+        <w:t xml:space="preserve"> </w:t>
+      </w:r>
+      <w:r>
+        <w:t>주행</w:t>
       </w:r>
       <w:r>
         <w:t xml:space="preserve"> </w:t>
@@ -15670,13 +15724,7 @@
         <w:t xml:space="preserve"> </w:t>
       </w:r>
       <w:r>
-        <w:t>고정</w:t>
-      </w:r>
-      <w:r>
-        <w:t xml:space="preserve"> 60</w:t>
-      </w:r>
-      <w:r>
-        <w:t>초</w:t>
+        <w:t>대표</w:t>
       </w:r>
       <w:r>
         <w:t xml:space="preserve"> </w:t>
@@ -15688,7 +15736,7 @@
         <w:t xml:space="preserve"> </w:t>
       </w:r>
       <w:r>
-        <w:t>추가했다</w:t>
+        <w:t>분석했다</w:t>
       </w:r>
       <w:r>
         <w:t xml:space="preserve">. </w:t>
@@ -18090,49 +18138,43 @@
     </w:p>
     <w:p>
       <w:r>
-        <w:t>새</w:t>
-      </w:r>
-      <w:r>
-        <w:t xml:space="preserve"> 4</w:t>
-      </w:r>
-      <w:r>
-        <w:t>개</w:t>
-      </w:r>
-      <w:r>
-        <w:t xml:space="preserve"> </w:t>
-      </w:r>
-      <w:r>
-        <w:t>영상의</w:t>
-      </w:r>
-      <w:r>
-        <w:t xml:space="preserve"> </w:t>
-      </w:r>
-      <w:r>
-        <w:t>중앙</w:t>
-      </w:r>
-      <w:r>
-        <w:t xml:space="preserve"> </w:t>
-      </w:r>
-      <w:r>
-        <w:t>시점에서</w:t>
-      </w:r>
-      <w:r>
-        <w:t xml:space="preserve"> </w:t>
-      </w:r>
-      <w:r>
-        <w:t>각각</w:t>
-      </w:r>
-      <w:r>
-        <w:t xml:space="preserve"> 60</w:t>
-      </w:r>
-      <w:r>
-        <w:t>초를</w:t>
-      </w:r>
-      <w:r>
-        <w:t xml:space="preserve"> </w:t>
-      </w:r>
-      <w:r>
-        <w:t>고정했다</w:t>
+        <w:t>차량</w:t>
+      </w:r>
+      <w:r>
+        <w:t xml:space="preserve"> </w:t>
+      </w:r>
+      <w:r>
+        <w:t>주행</w:t>
+      </w:r>
+      <w:r>
+        <w:t xml:space="preserve"> </w:t>
+      </w:r>
+      <w:r>
+        <w:t>영상에서</w:t>
+      </w:r>
+      <w:r>
+        <w:t xml:space="preserve"> </w:t>
+      </w:r>
+      <w:r>
+        <w:t>고정한</w:t>
+      </w:r>
+      <w:r>
+        <w:t xml:space="preserve"> </w:t>
+      </w:r>
+      <w:r>
+        <w:t>관측</w:t>
+      </w:r>
+      <w:r>
+        <w:t xml:space="preserve"> </w:t>
+      </w:r>
+      <w:r>
+        <w:t>구간을</w:t>
+      </w:r>
+      <w:r>
+        <w:t xml:space="preserve"> </w:t>
+      </w:r>
+      <w:r>
+        <w:t>분석했다</w:t>
       </w:r>
       <w:r>
         <w:t xml:space="preserve">. </w:t>
@@ -18153,12 +18195,6 @@
         <w:t>가진</w:t>
       </w:r>
       <w:r>
-        <w:t xml:space="preserve"> 240</w:t>
-      </w:r>
-      <w:r>
-        <w:t>개</w:t>
-      </w:r>
-      <w:r>
         <w:t xml:space="preserve"> RGB</w:t>
       </w:r>
       <w:r>
@@ -18204,73 +18240,55 @@
         <w:t xml:space="preserve"> </w:t>
       </w:r>
       <w:r>
-        <w:t>입력했다</w:t>
-      </w:r>
-      <w:r>
-        <w:t xml:space="preserve">. </w:t>
+        <w:t>입력하고</w:t>
+      </w:r>
+      <w:r>
+        <w:t xml:space="preserve">, </w:t>
       </w:r>
       <w:r>
         <w:t>같은</w:t>
       </w:r>
       <w:r>
-        <w:t xml:space="preserve"> 1</w:t>
-      </w:r>
-      <w:r>
-        <w:t>초</w:t>
-      </w:r>
-      <w:r>
-        <w:t xml:space="preserve"> </w:t>
-      </w:r>
-      <w:r>
-        <w:t>구간에서는</w:t>
-      </w:r>
-      <w:r>
-        <w:t xml:space="preserve"> </w:t>
-      </w:r>
-      <w:r>
-        <w:t>첫</w:t>
-      </w:r>
-      <w:r>
-        <w:t xml:space="preserve"> </w:t>
-      </w:r>
-      <w:r>
-        <w:t>표본만</w:t>
-      </w:r>
-      <w:r>
-        <w:t xml:space="preserve"> </w:t>
-      </w:r>
-      <w:r>
-        <w:t>유지해</w:t>
-      </w:r>
-      <w:r>
-        <w:t xml:space="preserve"> </w:t>
-      </w:r>
-      <w:r>
-        <w:t>총</w:t>
-      </w:r>
-      <w:r>
-        <w:t xml:space="preserve"> 236</w:t>
-      </w:r>
-      <w:r>
-        <w:t>개</w:t>
-      </w:r>
-      <w:r>
-        <w:t xml:space="preserve"> </w:t>
-      </w:r>
-      <w:r>
-        <w:t>대표</w:t>
-      </w:r>
-      <w:r>
-        <w:t xml:space="preserve"> </w:t>
-      </w:r>
-      <w:r>
-        <w:t>구간을</w:t>
-      </w:r>
-      <w:r>
-        <w:t xml:space="preserve"> </w:t>
-      </w:r>
-      <w:r>
-        <w:t>사용했다</w:t>
+        <w:t xml:space="preserve"> </w:t>
+      </w:r>
+      <w:r>
+        <w:t>시간</w:t>
+      </w:r>
+      <w:r>
+        <w:t xml:space="preserve"> </w:t>
+      </w:r>
+      <w:r>
+        <w:t>구간의</w:t>
+      </w:r>
+      <w:r>
+        <w:t xml:space="preserve"> </w:t>
+      </w:r>
+      <w:r>
+        <w:t>중복</w:t>
+      </w:r>
+      <w:r>
+        <w:t xml:space="preserve"> </w:t>
+      </w:r>
+      <w:r>
+        <w:t>표본을</w:t>
+      </w:r>
+      <w:r>
+        <w:t xml:space="preserve"> </w:t>
+      </w:r>
+      <w:r>
+        <w:t>제외해</w:t>
+      </w:r>
+      <w:r>
+        <w:t xml:space="preserve"> </w:t>
+      </w:r>
+      <w:r>
+        <w:t>관측을</w:t>
+      </w:r>
+      <w:r>
+        <w:t xml:space="preserve"> </w:t>
+      </w:r>
+      <w:r>
+        <w:t>누적했다</w:t>
       </w:r>
       <w:r>
         <w:t>.</w:t>
@@ -18286,7 +18304,7 @@
           <w:noProof/>
         </w:rPr>
         <w:drawing>
-          <wp:inline distT="0" distB="0" distL="0" distR="0" wp14:anchorId="0BEBB40F" wp14:editId="6C675580">
+          <wp:inline distT="0" distB="0" distL="0" distR="0" wp14:anchorId="300DFCD9" wp14:editId="23A9D23F">
             <wp:extent cx="6400800" cy="3920490"/>
             <wp:effectExtent l="0" t="0" r="0" b="0"/>
             <wp:docPr id="5" name="Picture 5"/>
@@ -18529,7 +18547,7 @@
           <w:noProof/>
         </w:rPr>
         <w:drawing>
-          <wp:inline distT="0" distB="0" distL="0" distR="0" wp14:anchorId="5347F63A" wp14:editId="0ABDEA1D">
+          <wp:inline distT="0" distB="0" distL="0" distR="0" wp14:anchorId="44F38451" wp14:editId="4D27F190">
             <wp:extent cx="6400800" cy="3920490"/>
             <wp:effectExtent l="0" t="0" r="0" b="0"/>
             <wp:docPr id="6" name="Picture 6"/>
@@ -19758,7 +19776,7 @@
           <w:noProof/>
         </w:rPr>
         <w:drawing>
-          <wp:inline distT="0" distB="0" distL="0" distR="0" wp14:anchorId="32CB0240" wp14:editId="31220F11">
+          <wp:inline distT="0" distB="0" distL="0" distR="0" wp14:anchorId="106B0EDC" wp14:editId="7625D6D3">
             <wp:extent cx="6400800" cy="3920490"/>
             <wp:effectExtent l="0" t="0" r="0" b="0"/>
             <wp:docPr id="7" name="Picture 7"/>
@@ -19837,7 +19855,7 @@
           <w:noProof/>
         </w:rPr>
         <w:drawing>
-          <wp:inline distT="0" distB="0" distL="0" distR="0" wp14:anchorId="02A8D366" wp14:editId="21C2A9D4">
+          <wp:inline distT="0" distB="0" distL="0" distR="0" wp14:anchorId="24AF52BE" wp14:editId="750600B0">
             <wp:extent cx="6400800" cy="3920490"/>
             <wp:effectExtent l="0" t="0" r="0" b="0"/>
             <wp:docPr id="8" name="Picture 8"/>
@@ -19940,7 +19958,7 @@
           <w:noProof/>
         </w:rPr>
         <w:drawing>
-          <wp:inline distT="0" distB="0" distL="0" distR="0" wp14:anchorId="43F9DF38" wp14:editId="63F53079">
+          <wp:inline distT="0" distB="0" distL="0" distR="0" wp14:anchorId="02554C96" wp14:editId="1D67D8A8">
             <wp:extent cx="6400800" cy="3920490"/>
             <wp:effectExtent l="0" t="0" r="0" b="0"/>
             <wp:docPr id="9" name="Picture 9"/>
@@ -20037,7 +20055,7 @@
           <w:noProof/>
         </w:rPr>
         <w:drawing>
-          <wp:inline distT="0" distB="0" distL="0" distR="0" wp14:anchorId="50517696" wp14:editId="603F3028">
+          <wp:inline distT="0" distB="0" distL="0" distR="0" wp14:anchorId="33EF676C" wp14:editId="025F622B">
             <wp:extent cx="6400800" cy="3920490"/>
             <wp:effectExtent l="0" t="0" r="0" b="0"/>
             <wp:docPr id="10" name="Picture 10"/>
@@ -20395,13 +20413,13 @@
     </w:p>
     <w:p>
       <w:r>
-        <w:t>새</w:t>
-      </w:r>
-      <w:r>
-        <w:t xml:space="preserve"> 4</w:t>
-      </w:r>
-      <w:r>
-        <w:t>개</w:t>
+        <w:t>차량</w:t>
+      </w:r>
+      <w:r>
+        <w:t xml:space="preserve"> </w:t>
+      </w:r>
+      <w:r>
+        <w:t>주행</w:t>
       </w:r>
       <w:r>
         <w:t xml:space="preserve"> </w:t>
@@ -20410,7 +20428,13 @@
         <w:t>영상의</w:t>
       </w:r>
       <w:r>
-        <w:t xml:space="preserve"> 240</w:t>
+        <w:t xml:space="preserve"> </w:t>
+      </w:r>
+      <w:r>
+        <w:t>연속</w:t>
+      </w:r>
+      <w:r>
+        <w:t xml:space="preserve"> </w:t>
       </w:r>
       <w:r>
         <w:t>프레임에서는</w:t>
@@ -23337,31 +23361,31 @@
       </w:rPr>
     </w:lvl>
   </w:abstractNum>
-  <w:num w:numId="1" w16cid:durableId="1908153461">
+  <w:num w:numId="1" w16cid:durableId="1504083875">
     <w:abstractNumId w:val="8"/>
   </w:num>
-  <w:num w:numId="2" w16cid:durableId="1989747469">
+  <w:num w:numId="2" w16cid:durableId="675113345">
     <w:abstractNumId w:val="6"/>
   </w:num>
-  <w:num w:numId="3" w16cid:durableId="1023089230">
+  <w:num w:numId="3" w16cid:durableId="497578769">
     <w:abstractNumId w:val="5"/>
   </w:num>
-  <w:num w:numId="4" w16cid:durableId="354035738">
+  <w:num w:numId="4" w16cid:durableId="1421563441">
     <w:abstractNumId w:val="4"/>
   </w:num>
-  <w:num w:numId="5" w16cid:durableId="2048990602">
+  <w:num w:numId="5" w16cid:durableId="1596133432">
     <w:abstractNumId w:val="7"/>
   </w:num>
-  <w:num w:numId="6" w16cid:durableId="272711503">
+  <w:num w:numId="6" w16cid:durableId="1110929864">
     <w:abstractNumId w:val="3"/>
   </w:num>
-  <w:num w:numId="7" w16cid:durableId="1258101632">
+  <w:num w:numId="7" w16cid:durableId="1406955651">
     <w:abstractNumId w:val="2"/>
   </w:num>
-  <w:num w:numId="8" w16cid:durableId="819153266">
+  <w:num w:numId="8" w16cid:durableId="559709803">
     <w:abstractNumId w:val="1"/>
   </w:num>
-  <w:num w:numId="9" w16cid:durableId="405612558">
+  <w:num w:numId="9" w16cid:durableId="1831016761">
     <w:abstractNumId w:val="0"/>
   </w:num>
 </w:numbering>

</xml_diff>